<commit_message>
feat: dark mode, analytics & ui improvements
</commit_message>
<xml_diff>
--- a/public/templates/template.docx
+++ b/public/templates/template.docx
@@ -321,6 +321,7 @@
               </w:rPr>
               <w:t>{</w:t>
             </w:r>
+            <w:proofErr w:type="spellStart"/>
             <w:r>
               <w:rPr>
                 <w:sz w:val="24"/>
@@ -329,6 +330,7 @@
               </w:rPr>
               <w:t>customer_company</w:t>
             </w:r>
+            <w:proofErr w:type="spellEnd"/>
             <w:r>
               <w:rPr>
                 <w:sz w:val="24"/>
@@ -392,6 +394,7 @@
               </w:rPr>
               <w:t>{</w:t>
             </w:r>
+            <w:proofErr w:type="spellStart"/>
             <w:r>
               <w:rPr>
                 <w:sz w:val="24"/>
@@ -400,6 +403,7 @@
               </w:rPr>
               <w:t>sender_name</w:t>
             </w:r>
+            <w:proofErr w:type="spellEnd"/>
             <w:r>
               <w:rPr>
                 <w:sz w:val="24"/>
@@ -467,6 +471,7 @@
               </w:rPr>
               <w:t>{</w:t>
             </w:r>
+            <w:proofErr w:type="spellStart"/>
             <w:r>
               <w:rPr>
                 <w:sz w:val="24"/>
@@ -481,7 +486,16 @@
                 <w:szCs w:val="24"/>
                 <w:lang w:val="en-US"/>
               </w:rPr>
-              <w:t>_fio}</w:t>
+              <w:t>_fio</w:t>
+            </w:r>
+            <w:proofErr w:type="spellEnd"/>
+            <w:r>
+              <w:rPr>
+                <w:sz w:val="24"/>
+                <w:szCs w:val="24"/>
+                <w:lang w:val="en-US"/>
+              </w:rPr>
+              <w:t>}</w:t>
             </w:r>
           </w:p>
         </w:tc>
@@ -527,6 +541,7 @@
               </w:rPr>
               <w:t>{</w:t>
             </w:r>
+            <w:proofErr w:type="spellStart"/>
             <w:r>
               <w:rPr>
                 <w:sz w:val="24"/>
@@ -535,6 +550,7 @@
               </w:rPr>
               <w:t>sender_phone</w:t>
             </w:r>
+            <w:proofErr w:type="spellEnd"/>
             <w:r>
               <w:rPr>
                 <w:sz w:val="24"/>
@@ -602,6 +618,7 @@
               </w:rPr>
               <w:t>{</w:t>
             </w:r>
+            <w:proofErr w:type="spellStart"/>
             <w:r>
               <w:rPr>
                 <w:sz w:val="24"/>
@@ -616,7 +633,16 @@
                 <w:szCs w:val="24"/>
                 <w:lang w:val="en-US"/>
               </w:rPr>
-              <w:t>_address}</w:t>
+              <w:t>_address</w:t>
+            </w:r>
+            <w:proofErr w:type="spellEnd"/>
+            <w:r>
+              <w:rPr>
+                <w:sz w:val="24"/>
+                <w:szCs w:val="24"/>
+                <w:lang w:val="en-US"/>
+              </w:rPr>
+              <w:t>}</w:t>
             </w:r>
           </w:p>
         </w:tc>
@@ -676,7 +702,25 @@
                 <w:szCs w:val="24"/>
                 <w:lang w:val="en-US"/>
               </w:rPr>
-              <w:t>{expeditor_name}</w:t>
+              <w:t>{</w:t>
+            </w:r>
+            <w:proofErr w:type="spellStart"/>
+            <w:r>
+              <w:rPr>
+                <w:sz w:val="24"/>
+                <w:szCs w:val="24"/>
+                <w:lang w:val="en-US"/>
+              </w:rPr>
+              <w:t>expeditor_name</w:t>
+            </w:r>
+            <w:proofErr w:type="spellEnd"/>
+            <w:r>
+              <w:rPr>
+                <w:sz w:val="24"/>
+                <w:szCs w:val="24"/>
+                <w:lang w:val="en-US"/>
+              </w:rPr>
+              <w:t>}</w:t>
             </w:r>
           </w:p>
         </w:tc>
@@ -734,14 +778,25 @@
                 <w:szCs w:val="24"/>
                 <w:lang w:val="en-US"/>
               </w:rPr>
-              <w:t>{expeditor_phone}</w:t>
-            </w:r>
-            <w:r>
-              <w:rPr>
-                <w:sz w:val="24"/>
-                <w:szCs w:val="24"/>
-              </w:rPr>
-              <w:t xml:space="preserve"> </w:t>
+              <w:t>{</w:t>
+            </w:r>
+            <w:proofErr w:type="spellStart"/>
+            <w:r>
+              <w:rPr>
+                <w:sz w:val="24"/>
+                <w:szCs w:val="24"/>
+                <w:lang w:val="en-US"/>
+              </w:rPr>
+              <w:t>expeditor_phone</w:t>
+            </w:r>
+            <w:proofErr w:type="spellEnd"/>
+            <w:r>
+              <w:rPr>
+                <w:sz w:val="24"/>
+                <w:szCs w:val="24"/>
+                <w:lang w:val="en-US"/>
+              </w:rPr>
+              <w:t>}</w:t>
             </w:r>
           </w:p>
         </w:tc>
@@ -809,7 +864,25 @@
                 <w:szCs w:val="24"/>
                 <w:lang w:val="en-US"/>
               </w:rPr>
-              <w:t>{expeditor_email}</w:t>
+              <w:t>{</w:t>
+            </w:r>
+            <w:proofErr w:type="spellStart"/>
+            <w:r>
+              <w:rPr>
+                <w:sz w:val="24"/>
+                <w:szCs w:val="24"/>
+                <w:lang w:val="en-US"/>
+              </w:rPr>
+              <w:t>expeditor_email</w:t>
+            </w:r>
+            <w:proofErr w:type="spellEnd"/>
+            <w:r>
+              <w:rPr>
+                <w:sz w:val="24"/>
+                <w:szCs w:val="24"/>
+                <w:lang w:val="en-US"/>
+              </w:rPr>
+              <w:t>}</w:t>
             </w:r>
           </w:p>
         </w:tc>
@@ -861,7 +934,25 @@
                 <w:szCs w:val="24"/>
                 <w:lang w:val="en-US"/>
               </w:rPr>
-              <w:t>{expeditor_address}</w:t>
+              <w:t>{</w:t>
+            </w:r>
+            <w:proofErr w:type="spellStart"/>
+            <w:r>
+              <w:rPr>
+                <w:sz w:val="24"/>
+                <w:szCs w:val="24"/>
+                <w:lang w:val="en-US"/>
+              </w:rPr>
+              <w:t>expeditor_address</w:t>
+            </w:r>
+            <w:proofErr w:type="spellEnd"/>
+            <w:r>
+              <w:rPr>
+                <w:sz w:val="24"/>
+                <w:szCs w:val="24"/>
+                <w:lang w:val="en-US"/>
+              </w:rPr>
+              <w:t>}</w:t>
             </w:r>
           </w:p>
         </w:tc>
@@ -953,7 +1044,25 @@
                 <w:szCs w:val="24"/>
                 <w:lang w:val="en-US"/>
               </w:rPr>
-              <w:t>{cargoText}</w:t>
+              <w:t>{</w:t>
+            </w:r>
+            <w:proofErr w:type="spellStart"/>
+            <w:r>
+              <w:rPr>
+                <w:sz w:val="24"/>
+                <w:szCs w:val="24"/>
+                <w:lang w:val="en-US"/>
+              </w:rPr>
+              <w:t>cargoText</w:t>
+            </w:r>
+            <w:proofErr w:type="spellEnd"/>
+            <w:r>
+              <w:rPr>
+                <w:sz w:val="24"/>
+                <w:szCs w:val="24"/>
+                <w:lang w:val="en-US"/>
+              </w:rPr>
+              <w:t>}</w:t>
             </w:r>
           </w:p>
         </w:tc>
@@ -995,9 +1104,43 @@
               <w:rPr>
                 <w:sz w:val="24"/>
                 <w:szCs w:val="24"/>
-                <w:lang w:val="en-US"/>
-              </w:rPr>
-            </w:pPr>
+              </w:rPr>
+            </w:pPr>
+            <w:r>
+              <w:rPr>
+                <w:sz w:val="24"/>
+                <w:szCs w:val="24"/>
+                <w:lang w:val="en-US"/>
+              </w:rPr>
+              <w:t>{</w:t>
+            </w:r>
+            <w:proofErr w:type="spellStart"/>
+            <w:r>
+              <w:rPr>
+                <w:sz w:val="24"/>
+                <w:szCs w:val="24"/>
+                <w:lang w:val="en-US"/>
+              </w:rPr>
+              <w:t>cargoValue</w:t>
+            </w:r>
+            <w:proofErr w:type="spellEnd"/>
+            <w:r>
+              <w:rPr>
+                <w:sz w:val="24"/>
+                <w:szCs w:val="24"/>
+                <w:lang w:val="en-US"/>
+              </w:rPr>
+              <w:t>}</w:t>
+            </w:r>
+            <w:proofErr w:type="spellStart"/>
+            <w:r>
+              <w:rPr>
+                <w:sz w:val="24"/>
+                <w:szCs w:val="24"/>
+              </w:rPr>
+              <w:t>тг</w:t>
+            </w:r>
+            <w:proofErr w:type="spellEnd"/>
           </w:p>
         </w:tc>
       </w:tr>
@@ -1097,7 +1240,34 @@
                 <w:szCs w:val="24"/>
                 <w:lang w:val="en-US"/>
               </w:rPr>
-              <w:t>{total_seats}</w:t>
+              <w:t>{</w:t>
+            </w:r>
+            <w:proofErr w:type="spellStart"/>
+            <w:r>
+              <w:rPr>
+                <w:sz w:val="24"/>
+                <w:szCs w:val="24"/>
+                <w:lang w:val="en-US"/>
+              </w:rPr>
+              <w:t>total_</w:t>
+            </w:r>
+            <w:proofErr w:type="gramStart"/>
+            <w:r>
+              <w:rPr>
+                <w:sz w:val="24"/>
+                <w:szCs w:val="24"/>
+                <w:lang w:val="en-US"/>
+              </w:rPr>
+              <w:t>seats</w:t>
+            </w:r>
+            <w:proofErr w:type="spellEnd"/>
+            <w:r>
+              <w:rPr>
+                <w:sz w:val="24"/>
+                <w:szCs w:val="24"/>
+                <w:lang w:val="en-US"/>
+              </w:rPr>
+              <w:t>}</w:t>
             </w:r>
             <w:r>
               <w:rPr>
@@ -1106,6 +1276,7 @@
               </w:rPr>
               <w:t>м</w:t>
             </w:r>
+            <w:proofErr w:type="gramEnd"/>
           </w:p>
         </w:tc>
       </w:tr>
@@ -1154,7 +1325,34 @@
                 <w:szCs w:val="24"/>
                 <w:lang w:val="en-US"/>
               </w:rPr>
-              <w:t>{total_weight}</w:t>
+              <w:t>{</w:t>
+            </w:r>
+            <w:proofErr w:type="spellStart"/>
+            <w:r>
+              <w:rPr>
+                <w:sz w:val="24"/>
+                <w:szCs w:val="24"/>
+                <w:lang w:val="en-US"/>
+              </w:rPr>
+              <w:t>total_</w:t>
+            </w:r>
+            <w:proofErr w:type="gramStart"/>
+            <w:r>
+              <w:rPr>
+                <w:sz w:val="24"/>
+                <w:szCs w:val="24"/>
+                <w:lang w:val="en-US"/>
+              </w:rPr>
+              <w:t>weight</w:t>
+            </w:r>
+            <w:proofErr w:type="spellEnd"/>
+            <w:r>
+              <w:rPr>
+                <w:sz w:val="24"/>
+                <w:szCs w:val="24"/>
+                <w:lang w:val="en-US"/>
+              </w:rPr>
+              <w:t>}</w:t>
             </w:r>
             <w:r>
               <w:rPr>
@@ -1163,6 +1361,7 @@
               </w:rPr>
               <w:t>кг</w:t>
             </w:r>
+            <w:proofErr w:type="gramEnd"/>
           </w:p>
         </w:tc>
       </w:tr>
@@ -1186,8 +1385,17 @@
                 <w:sz w:val="24"/>
                 <w:szCs w:val="18"/>
               </w:rPr>
-              <w:t>Крепление, штабелирование</w:t>
-            </w:r>
+              <w:t xml:space="preserve">Крепление, </w:t>
+            </w:r>
+            <w:proofErr w:type="spellStart"/>
+            <w:r>
+              <w:rPr>
+                <w:sz w:val="24"/>
+                <w:szCs w:val="18"/>
+              </w:rPr>
+              <w:t>штабелирование</w:t>
+            </w:r>
+            <w:proofErr w:type="spellEnd"/>
           </w:p>
         </w:tc>
         <w:tc>
@@ -1307,7 +1515,16 @@
                 <w:szCs w:val="24"/>
                 <w:lang w:val="en-US"/>
               </w:rPr>
-              <w:t>{from</w:t>
+              <w:t>{</w:t>
+            </w:r>
+            <w:proofErr w:type="spellStart"/>
+            <w:r>
+              <w:rPr>
+                <w:sz w:val="24"/>
+                <w:szCs w:val="24"/>
+                <w:lang w:val="en-US"/>
+              </w:rPr>
+              <w:t>from</w:t>
             </w:r>
             <w:r>
               <w:rPr>
@@ -1323,7 +1540,16 @@
                 <w:szCs w:val="24"/>
                 <w:lang w:val="en-US"/>
               </w:rPr>
-              <w:t>ity}</w:t>
+              <w:t>ity</w:t>
+            </w:r>
+            <w:proofErr w:type="spellEnd"/>
+            <w:r>
+              <w:rPr>
+                <w:sz w:val="24"/>
+                <w:szCs w:val="24"/>
+                <w:lang w:val="en-US"/>
+              </w:rPr>
+              <w:t>}</w:t>
             </w:r>
           </w:p>
         </w:tc>
@@ -1434,7 +1660,25 @@
                 <w:szCs w:val="24"/>
                 <w:lang w:val="en-US"/>
               </w:rPr>
-              <w:t>{toCity}</w:t>
+              <w:t>{</w:t>
+            </w:r>
+            <w:proofErr w:type="spellStart"/>
+            <w:r>
+              <w:rPr>
+                <w:sz w:val="24"/>
+                <w:szCs w:val="24"/>
+                <w:lang w:val="en-US"/>
+              </w:rPr>
+              <w:t>toCity</w:t>
+            </w:r>
+            <w:proofErr w:type="spellEnd"/>
+            <w:r>
+              <w:rPr>
+                <w:sz w:val="24"/>
+                <w:szCs w:val="24"/>
+                <w:lang w:val="en-US"/>
+              </w:rPr>
+              <w:t>}</w:t>
             </w:r>
           </w:p>
         </w:tc>
@@ -1486,7 +1730,25 @@
                 <w:szCs w:val="24"/>
                 <w:lang w:val="en-US"/>
               </w:rPr>
-              <w:t>{receiver_company}</w:t>
+              <w:t>{</w:t>
+            </w:r>
+            <w:proofErr w:type="spellStart"/>
+            <w:r>
+              <w:rPr>
+                <w:sz w:val="24"/>
+                <w:szCs w:val="24"/>
+                <w:lang w:val="en-US"/>
+              </w:rPr>
+              <w:t>receiver_company</w:t>
+            </w:r>
+            <w:proofErr w:type="spellEnd"/>
+            <w:r>
+              <w:rPr>
+                <w:sz w:val="24"/>
+                <w:szCs w:val="24"/>
+                <w:lang w:val="en-US"/>
+              </w:rPr>
+              <w:t>}</w:t>
             </w:r>
           </w:p>
         </w:tc>
@@ -1541,6 +1803,7 @@
               </w:rPr>
               <w:t>{</w:t>
             </w:r>
+            <w:proofErr w:type="spellStart"/>
             <w:r>
               <w:rPr>
                 <w:sz w:val="24"/>
@@ -1549,6 +1812,7 @@
               </w:rPr>
               <w:t>toCity</w:t>
             </w:r>
+            <w:proofErr w:type="spellEnd"/>
             <w:r>
               <w:rPr>
                 <w:sz w:val="24"/>
@@ -1579,7 +1843,16 @@
                 <w:szCs w:val="24"/>
                 <w:lang w:val="en-US"/>
               </w:rPr>
-              <w:t>{toA</w:t>
+              <w:t>{</w:t>
+            </w:r>
+            <w:proofErr w:type="spellStart"/>
+            <w:r>
+              <w:rPr>
+                <w:sz w:val="24"/>
+                <w:szCs w:val="24"/>
+                <w:lang w:val="en-US"/>
+              </w:rPr>
+              <w:t>toA</w:t>
             </w:r>
             <w:r>
               <w:rPr>
@@ -1595,7 +1868,16 @@
                 <w:szCs w:val="24"/>
                 <w:lang w:val="en-US"/>
               </w:rPr>
-              <w:t>dress}</w:t>
+              <w:t>dress</w:t>
+            </w:r>
+            <w:proofErr w:type="spellEnd"/>
+            <w:r>
+              <w:rPr>
+                <w:sz w:val="24"/>
+                <w:szCs w:val="24"/>
+                <w:lang w:val="en-US"/>
+              </w:rPr>
+              <w:t>}</w:t>
             </w:r>
           </w:p>
         </w:tc>
@@ -1620,24 +1902,8 @@
               <w:rPr>
                 <w:sz w:val="24"/>
                 <w:szCs w:val="18"/>
-                <w:lang w:val="en-US"/>
-              </w:rPr>
-              <w:t>e</w:t>
-            </w:r>
-            <w:r>
-              <w:rPr>
-                <w:sz w:val="24"/>
-                <w:szCs w:val="18"/>
-              </w:rPr>
-              <w:t>-</w:t>
-            </w:r>
-            <w:r>
-              <w:rPr>
-                <w:sz w:val="24"/>
-                <w:szCs w:val="18"/>
-                <w:lang w:val="en-US"/>
-              </w:rPr>
-              <w:t>mail</w:t>
+              </w:rPr>
+              <w:t>Срок доставки</w:t>
             </w:r>
           </w:p>
         </w:tc>
@@ -1656,56 +1922,31 @@
                 <w:szCs w:val="24"/>
               </w:rPr>
             </w:pPr>
-          </w:p>
-        </w:tc>
-      </w:tr>
-      <w:tr>
-        <w:tc>
-          <w:tcPr>
-            <w:tcW w:w="3539" w:type="dxa"/>
-          </w:tcPr>
-          <w:p>
-            <w:pPr>
-              <w:tabs>
-                <w:tab w:val="left" w:pos="0"/>
-              </w:tabs>
-              <w:jc w:val="both"/>
-              <w:rPr>
-                <w:sz w:val="24"/>
-                <w:szCs w:val="18"/>
-              </w:rPr>
-            </w:pPr>
-            <w:r>
-              <w:rPr>
-                <w:sz w:val="24"/>
-                <w:szCs w:val="18"/>
-              </w:rPr>
-              <w:t>Срок доставки</w:t>
-            </w:r>
-          </w:p>
-        </w:tc>
-        <w:tc>
-          <w:tcPr>
-            <w:tcW w:w="6917" w:type="dxa"/>
-          </w:tcPr>
-          <w:p>
-            <w:pPr>
-              <w:tabs>
-                <w:tab w:val="left" w:pos="0"/>
-              </w:tabs>
-              <w:jc w:val="both"/>
-              <w:rPr>
-                <w:sz w:val="24"/>
-                <w:szCs w:val="24"/>
-              </w:rPr>
-            </w:pPr>
-            <w:r>
-              <w:rPr>
-                <w:sz w:val="24"/>
-                <w:szCs w:val="24"/>
-                <w:lang w:val="en-US"/>
-              </w:rPr>
-              <w:t>{deliveryTerm}</w:t>
+            <w:r>
+              <w:rPr>
+                <w:sz w:val="24"/>
+                <w:szCs w:val="24"/>
+                <w:lang w:val="en-US"/>
+              </w:rPr>
+              <w:t>{</w:t>
+            </w:r>
+            <w:proofErr w:type="spellStart"/>
+            <w:r>
+              <w:rPr>
+                <w:sz w:val="24"/>
+                <w:szCs w:val="24"/>
+                <w:lang w:val="en-US"/>
+              </w:rPr>
+              <w:t>deliveryTerm</w:t>
+            </w:r>
+            <w:proofErr w:type="spellEnd"/>
+            <w:r>
+              <w:rPr>
+                <w:sz w:val="24"/>
+                <w:szCs w:val="24"/>
+                <w:lang w:val="en-US"/>
+              </w:rPr>
+              <w:t>}</w:t>
             </w:r>
             <w:r>
               <w:rPr>
@@ -1787,13 +2028,33 @@
                 <w:szCs w:val="18"/>
                 <w:lang w:val="en-US"/>
               </w:rPr>
-              <w:t>{insured_yes}</w:t>
-            </w:r>
+              <w:t>{</w:t>
+            </w:r>
+            <w:proofErr w:type="spellStart"/>
             <w:r>
               <w:rPr>
                 <w:b/>
                 <w:sz w:val="24"/>
                 <w:szCs w:val="18"/>
+                <w:lang w:val="en-US"/>
+              </w:rPr>
+              <w:t>insured_yes</w:t>
+            </w:r>
+            <w:proofErr w:type="spellEnd"/>
+            <w:r>
+              <w:rPr>
+                <w:b/>
+                <w:sz w:val="24"/>
+                <w:szCs w:val="18"/>
+                <w:lang w:val="en-US"/>
+              </w:rPr>
+              <w:t>}</w:t>
+            </w:r>
+            <w:r>
+              <w:rPr>
+                <w:b/>
+                <w:sz w:val="24"/>
+                <w:szCs w:val="18"/>
               </w:rPr>
               <w:t xml:space="preserve"> Да</w:t>
             </w:r>
@@ -1821,6 +2082,7 @@
               </w:rPr>
               <w:t>{</w:t>
             </w:r>
+            <w:proofErr w:type="spellStart"/>
             <w:r>
               <w:rPr>
                 <w:b/>
@@ -1830,6 +2092,7 @@
               </w:rPr>
               <w:t>insured_no</w:t>
             </w:r>
+            <w:proofErr w:type="spellEnd"/>
             <w:r>
               <w:rPr>
                 <w:b/>
@@ -1979,18 +2242,36 @@
                 <w:tab w:val="left" w:pos="2943"/>
               </w:tabs>
               <w:rPr>
-                <w:sz w:val="18"/>
-                <w:szCs w:val="18"/>
-                <w:lang w:val="en-US"/>
-              </w:rPr>
-            </w:pPr>
-            <w:r>
-              <w:rPr>
-                <w:sz w:val="18"/>
-                <w:szCs w:val="18"/>
-                <w:lang w:val="en-US"/>
-              </w:rPr>
-              <w:t>{services_total}</w:t>
+                <w:sz w:val="24"/>
+                <w:szCs w:val="24"/>
+                <w:lang w:val="en-US"/>
+              </w:rPr>
+            </w:pPr>
+            <w:r>
+              <w:rPr>
+                <w:sz w:val="24"/>
+                <w:szCs w:val="24"/>
+                <w:lang w:val="en-US"/>
+              </w:rPr>
+              <w:t>{</w:t>
+            </w:r>
+            <w:proofErr w:type="spellStart"/>
+            <w:r>
+              <w:rPr>
+                <w:sz w:val="24"/>
+                <w:szCs w:val="24"/>
+                <w:lang w:val="en-US"/>
+              </w:rPr>
+              <w:t>services_total</w:t>
+            </w:r>
+            <w:proofErr w:type="spellEnd"/>
+            <w:r>
+              <w:rPr>
+                <w:sz w:val="24"/>
+                <w:szCs w:val="24"/>
+                <w:lang w:val="en-US"/>
+              </w:rPr>
+              <w:t>}</w:t>
             </w:r>
           </w:p>
         </w:tc>
@@ -2028,7 +2309,6 @@
               <w:tabs>
                 <w:tab w:val="left" w:pos="2943"/>
               </w:tabs>
-              <w:jc w:val="both"/>
               <w:rPr>
                 <w:sz w:val="18"/>
                 <w:szCs w:val="18"/>
@@ -2037,8 +2317,8 @@
             </w:pPr>
             <w:r>
               <w:rPr>
-                <w:sz w:val="18"/>
-                <w:szCs w:val="18"/>
+                <w:sz w:val="24"/>
+                <w:szCs w:val="24"/>
                 <w:lang w:val="en-US"/>
               </w:rPr>
               <w:t>{comment}</w:t>
@@ -2174,89 +2454,6 @@
         <w:rPr>
           <w:b/>
           <w:sz w:val="24"/>
-          <w:lang w:val="en-US"/>
-        </w:rPr>
-      </w:pPr>
-      <w:r>
-        <w:rPr>
-          <w:b/>
-          <w:sz w:val="24"/>
-        </w:rPr>
-        <w:t>Заказчик</w:t>
-      </w:r>
-      <w:r>
-        <w:rPr>
-          <w:b/>
-          <w:sz w:val="24"/>
-          <w:lang w:val="en-US"/>
-        </w:rPr>
-        <w:t>:</w:t>
-      </w:r>
-    </w:p>
-    <w:p>
-      <w:pPr>
-        <w:pStyle w:val="a4"/>
-        <w:jc w:val="both"/>
-        <w:rPr>
-          <w:b/>
-          <w:bCs/>
-          <w:sz w:val="20"/>
-          <w:lang w:val="en-US"/>
-        </w:rPr>
-      </w:pPr>
-      <w:r>
-        <w:rPr>
-          <w:b/>
-          <w:bCs/>
-          <w:sz w:val="24"/>
-          <w:lang w:val="en-US"/>
-        </w:rPr>
-        <w:t>{</w:t>
-      </w:r>
-      <w:r>
-        <w:rPr>
-          <w:b/>
-          <w:bCs/>
-          <w:sz w:val="24"/>
-          <w:lang w:val="en-US"/>
-        </w:rPr>
-        <w:t>customer</w:t>
-      </w:r>
-      <w:r>
-        <w:rPr>
-          <w:b/>
-          <w:bCs/>
-          <w:sz w:val="24"/>
-          <w:lang w:val="en-US"/>
-        </w:rPr>
-        <w:t>_</w:t>
-      </w:r>
-      <w:r>
-        <w:rPr>
-          <w:b/>
-          <w:bCs/>
-          <w:sz w:val="24"/>
-          <w:lang w:val="en-US"/>
-        </w:rPr>
-        <w:t>company</w:t>
-      </w:r>
-      <w:r>
-        <w:rPr>
-          <w:b/>
-          <w:bCs/>
-          <w:sz w:val="24"/>
-          <w:lang w:val="en-US"/>
-        </w:rPr>
-        <w:t>}</w:t>
-      </w:r>
-    </w:p>
-    <w:p>
-      <w:pPr>
-        <w:pStyle w:val="a4"/>
-        <w:jc w:val="both"/>
-        <w:rPr>
-          <w:sz w:val="20"/>
-          <w:lang w:val="en-US"/>
         </w:rPr>
       </w:pPr>
     </w:p>
@@ -2265,6 +2462,132 @@
         <w:pStyle w:val="a4"/>
         <w:jc w:val="both"/>
         <w:rPr>
+          <w:b/>
+          <w:sz w:val="24"/>
+          <w:lang w:val="en-US"/>
+        </w:rPr>
+      </w:pPr>
+      <w:r>
+        <w:rPr>
+          <w:b/>
+          <w:sz w:val="24"/>
+        </w:rPr>
+        <w:t>Заказчик</w:t>
+      </w:r>
+      <w:r>
+        <w:rPr>
+          <w:b/>
+          <w:sz w:val="24"/>
+          <w:lang w:val="en-US"/>
+        </w:rPr>
+        <w:t>:</w:t>
+      </w:r>
+    </w:p>
+    <w:p>
+      <w:pPr>
+        <w:pStyle w:val="a4"/>
+        <w:jc w:val="both"/>
+        <w:rPr>
+          <w:b/>
+          <w:bCs/>
+          <w:sz w:val="20"/>
+          <w:lang w:val="en-US"/>
+        </w:rPr>
+      </w:pPr>
+      <w:r>
+        <w:rPr>
+          <w:b/>
+          <w:bCs/>
+          <w:sz w:val="24"/>
+          <w:lang w:val="en-US"/>
+        </w:rPr>
+        <w:t>{</w:t>
+      </w:r>
+      <w:proofErr w:type="spellStart"/>
+      <w:r>
+        <w:rPr>
+          <w:b/>
+          <w:bCs/>
+          <w:sz w:val="24"/>
+          <w:lang w:val="en-US"/>
+        </w:rPr>
+        <w:t>customer</w:t>
+      </w:r>
+      <w:r>
+        <w:rPr>
+          <w:b/>
+          <w:bCs/>
+          <w:sz w:val="24"/>
+          <w:lang w:val="en-US"/>
+        </w:rPr>
+        <w:t>_</w:t>
+      </w:r>
+      <w:r>
+        <w:rPr>
+          <w:b/>
+          <w:bCs/>
+          <w:sz w:val="24"/>
+          <w:lang w:val="en-US"/>
+        </w:rPr>
+        <w:t>company</w:t>
+      </w:r>
+      <w:proofErr w:type="spellEnd"/>
+      <w:r>
+        <w:rPr>
+          <w:b/>
+          <w:bCs/>
+          <w:sz w:val="24"/>
+          <w:lang w:val="en-US"/>
+        </w:rPr>
+        <w:t>}</w:t>
+      </w:r>
+    </w:p>
+    <w:p>
+      <w:pPr>
+        <w:pStyle w:val="a4"/>
+        <w:jc w:val="both"/>
+        <w:rPr>
+          <w:b/>
+          <w:bCs/>
+          <w:sz w:val="24"/>
+          <w:szCs w:val="28"/>
+        </w:rPr>
+      </w:pPr>
+      <w:r>
+        <w:rPr>
+          <w:b/>
+          <w:bCs/>
+          <w:sz w:val="24"/>
+          <w:szCs w:val="28"/>
+        </w:rPr>
+        <w:t>{</w:t>
+      </w:r>
+      <w:proofErr w:type="spellStart"/>
+      <w:r>
+        <w:rPr>
+          <w:b/>
+          <w:bCs/>
+          <w:sz w:val="24"/>
+          <w:szCs w:val="28"/>
+        </w:rPr>
+        <w:t>customer_director_name</w:t>
+      </w:r>
+      <w:proofErr w:type="spellEnd"/>
+      <w:r>
+        <w:rPr>
+          <w:b/>
+          <w:bCs/>
+          <w:sz w:val="24"/>
+          <w:szCs w:val="28"/>
+        </w:rPr>
+        <w:t>}</w:t>
+      </w:r>
+    </w:p>
+    <w:p>
+      <w:pPr>
+        <w:pStyle w:val="a4"/>
+        <w:jc w:val="both"/>
+        <w:rPr>
           <w:lang w:val="en-US"/>
         </w:rPr>
       </w:pPr>
@@ -2395,101 +2718,6 @@
         <w:rPr>
           <w:b/>
           <w:sz w:val="24"/>
-          <w:lang w:val="en-US"/>
-        </w:rPr>
-      </w:pPr>
-      <w:r>
-        <w:rPr>
-          <w:b/>
-          <w:sz w:val="24"/>
-        </w:rPr>
-        <w:t>Экспедитор</w:t>
-      </w:r>
-      <w:r>
-        <w:rPr>
-          <w:b/>
-          <w:sz w:val="24"/>
-          <w:lang w:val="en-US"/>
-        </w:rPr>
-        <w:t>:</w:t>
-      </w:r>
-    </w:p>
-    <w:p>
-      <w:pPr>
-        <w:pStyle w:val="a4"/>
-        <w:jc w:val="both"/>
-        <w:rPr>
-          <w:b/>
-          <w:sz w:val="24"/>
-          <w:lang w:val="en-US"/>
-        </w:rPr>
-      </w:pPr>
-      <w:r>
-        <w:rPr>
-          <w:b/>
-          <w:sz w:val="24"/>
-          <w:lang w:val="en-US"/>
-        </w:rPr>
-        <w:t>{</w:t>
-      </w:r>
-      <w:r>
-        <w:rPr>
-          <w:b/>
-          <w:sz w:val="24"/>
-          <w:lang w:val="en-US"/>
-        </w:rPr>
-        <w:t>expeditor</w:t>
-      </w:r>
-      <w:r>
-        <w:rPr>
-          <w:b/>
-          <w:sz w:val="24"/>
-          <w:lang w:val="en-US"/>
-        </w:rPr>
-        <w:t>_</w:t>
-      </w:r>
-      <w:r>
-        <w:rPr>
-          <w:b/>
-          <w:sz w:val="24"/>
-          <w:lang w:val="en-US"/>
-        </w:rPr>
-        <w:t>name</w:t>
-      </w:r>
-      <w:r>
-        <w:rPr>
-          <w:lang w:val="en-US"/>
-        </w:rPr>
-        <w:t>}</w:t>
-      </w:r>
-    </w:p>
-    <w:p>
-      <w:pPr>
-        <w:pStyle w:val="a4"/>
-        <w:jc w:val="both"/>
-        <w:rPr>
-          <w:b/>
-          <w:sz w:val="24"/>
-          <w:lang w:val="en-US"/>
-        </w:rPr>
-      </w:pPr>
-      <w:r>
-        <w:rPr>
-          <w:b/>
-          <w:sz w:val="24"/>
-          <w:lang w:val="en-US"/>
-        </w:rPr>
-        <w:t>{expeditor_director}</w:t>
-      </w:r>
-    </w:p>
-    <w:p>
-      <w:pPr>
-        <w:pStyle w:val="a4"/>
-        <w:jc w:val="both"/>
-        <w:rPr>
-          <w:b/>
-          <w:sz w:val="24"/>
-          <w:lang w:val="en-US"/>
         </w:rPr>
       </w:pPr>
     </w:p>
@@ -2502,40 +2730,31 @@
           <w:sz w:val="24"/>
         </w:rPr>
       </w:pPr>
-      <w:r>
-        <w:rPr>
-          <w:b/>
-          <w:sz w:val="24"/>
-        </w:rPr>
-        <w:t>____________________________</w:t>
-      </w:r>
-      <w:r>
-        <w:rPr>
-          <w:b/>
-          <w:sz w:val="24"/>
-        </w:rPr>
-        <w:t xml:space="preserve">      </w:t>
-      </w:r>
-      <w:r>
-        <w:rPr>
-          <w:sz w:val="24"/>
-        </w:rPr>
-        <w:t>М.П.</w:t>
-      </w:r>
     </w:p>
     <w:p>
       <w:pPr>
         <w:pStyle w:val="a4"/>
         <w:jc w:val="both"/>
         <w:rPr>
-          <w:sz w:val="20"/>
+          <w:b/>
+          <w:sz w:val="24"/>
+          <w:lang w:val="en-US"/>
         </w:rPr>
       </w:pPr>
       <w:r>
         <w:rPr>
-          <w:sz w:val="20"/>
-        </w:rPr>
-        <w:t xml:space="preserve">                         (подпись)                                                                                                                                                </w:t>
+          <w:b/>
+          <w:sz w:val="24"/>
+        </w:rPr>
+        <w:t>Экспедитор</w:t>
+      </w:r>
+      <w:r>
+        <w:rPr>
+          <w:b/>
+          <w:sz w:val="24"/>
+          <w:lang w:val="en-US"/>
+        </w:rPr>
+        <w:t>:</w:t>
       </w:r>
     </w:p>
     <w:p>
@@ -2543,7 +2762,113 @@
         <w:pStyle w:val="a4"/>
         <w:jc w:val="both"/>
         <w:rPr>
-          <w:sz w:val="20"/>
+          <w:b/>
+          <w:sz w:val="24"/>
+          <w:lang w:val="en-US"/>
+        </w:rPr>
+      </w:pPr>
+      <w:r>
+        <w:rPr>
+          <w:b/>
+          <w:sz w:val="24"/>
+          <w:lang w:val="en-US"/>
+        </w:rPr>
+        <w:t>{</w:t>
+      </w:r>
+      <w:proofErr w:type="spellStart"/>
+      <w:r>
+        <w:rPr>
+          <w:b/>
+          <w:sz w:val="24"/>
+          <w:lang w:val="en-US"/>
+        </w:rPr>
+        <w:t>expeditor</w:t>
+      </w:r>
+      <w:r>
+        <w:rPr>
+          <w:b/>
+          <w:sz w:val="24"/>
+          <w:lang w:val="en-US"/>
+        </w:rPr>
+        <w:t>_</w:t>
+      </w:r>
+      <w:r>
+        <w:rPr>
+          <w:b/>
+          <w:sz w:val="24"/>
+          <w:lang w:val="en-US"/>
+        </w:rPr>
+        <w:t>name</w:t>
+      </w:r>
+      <w:proofErr w:type="spellEnd"/>
+      <w:r>
+        <w:rPr>
+          <w:lang w:val="en-US"/>
+        </w:rPr>
+        <w:t>}</w:t>
+      </w:r>
+    </w:p>
+    <w:p>
+      <w:pPr>
+        <w:pStyle w:val="a4"/>
+        <w:jc w:val="both"/>
+        <w:rPr>
+          <w:b/>
+          <w:sz w:val="24"/>
+          <w:lang w:val="en-US"/>
+        </w:rPr>
+      </w:pPr>
+      <w:r>
+        <w:rPr>
+          <w:b/>
+          <w:sz w:val="24"/>
+          <w:lang w:val="en-US"/>
+        </w:rPr>
+        <w:t>{</w:t>
+      </w:r>
+      <w:proofErr w:type="spellStart"/>
+      <w:r>
+        <w:rPr>
+          <w:b/>
+          <w:sz w:val="24"/>
+          <w:lang w:val="en-US"/>
+        </w:rPr>
+        <w:t>expeditor_director</w:t>
+      </w:r>
+      <w:r>
+        <w:rPr>
+          <w:b/>
+          <w:sz w:val="24"/>
+          <w:lang w:val="en-US"/>
+        </w:rPr>
+        <w:t>_</w:t>
+      </w:r>
+      <w:r>
+        <w:rPr>
+          <w:b/>
+          <w:sz w:val="24"/>
+          <w:lang w:val="en-US"/>
+        </w:rPr>
+        <w:t>name</w:t>
+      </w:r>
+      <w:proofErr w:type="spellEnd"/>
+      <w:r>
+        <w:rPr>
+          <w:b/>
+          <w:sz w:val="24"/>
+          <w:lang w:val="en-US"/>
+        </w:rPr>
+        <w:t>}</w:t>
+      </w:r>
+    </w:p>
+    <w:p>
+      <w:pPr>
+        <w:pStyle w:val="a4"/>
+        <w:jc w:val="both"/>
+        <w:rPr>
+          <w:b/>
+          <w:sz w:val="24"/>
+          <w:lang w:val="en-US"/>
         </w:rPr>
       </w:pPr>
     </w:p>
@@ -2552,7 +2877,91 @@
         <w:pStyle w:val="a4"/>
         <w:jc w:val="both"/>
         <w:rPr>
+          <w:b/>
+          <w:sz w:val="24"/>
+          <w:lang w:val="en-US"/>
+        </w:rPr>
+      </w:pPr>
+      <w:r>
+        <w:rPr>
+          <w:b/>
+          <w:sz w:val="24"/>
+          <w:lang w:val="en-US"/>
+        </w:rPr>
+        <w:t>____________________________</w:t>
+      </w:r>
+      <w:r>
+        <w:rPr>
+          <w:b/>
+          <w:sz w:val="24"/>
+          <w:lang w:val="en-US"/>
+        </w:rPr>
+        <w:t xml:space="preserve">      </w:t>
+      </w:r>
+      <w:r>
+        <w:rPr>
+          <w:sz w:val="24"/>
+        </w:rPr>
+        <w:t>М</w:t>
+      </w:r>
+      <w:r>
+        <w:rPr>
+          <w:sz w:val="24"/>
+          <w:lang w:val="en-US"/>
+        </w:rPr>
+        <w:t>.</w:t>
+      </w:r>
+      <w:r>
+        <w:rPr>
+          <w:sz w:val="24"/>
+        </w:rPr>
+        <w:t>П</w:t>
+      </w:r>
+      <w:r>
+        <w:rPr>
+          <w:sz w:val="24"/>
+          <w:lang w:val="en-US"/>
+        </w:rPr>
+        <w:t>.</w:t>
+      </w:r>
+    </w:p>
+    <w:p>
+      <w:pPr>
+        <w:pStyle w:val="a4"/>
+        <w:jc w:val="both"/>
+        <w:rPr>
           <w:sz w:val="20"/>
+          <w:lang w:val="en-US"/>
+        </w:rPr>
+      </w:pPr>
+      <w:r>
+        <w:rPr>
+          <w:sz w:val="20"/>
+          <w:lang w:val="en-US"/>
+        </w:rPr>
+        <w:t xml:space="preserve">                         (</w:t>
+      </w:r>
+      <w:r>
+        <w:rPr>
+          <w:sz w:val="20"/>
+        </w:rPr>
+        <w:t>подпись</w:t>
+      </w:r>
+      <w:r>
+        <w:rPr>
+          <w:sz w:val="20"/>
+          <w:lang w:val="en-US"/>
+        </w:rPr>
+        <w:t xml:space="preserve">)                                                                                                                                                </w:t>
+      </w:r>
+    </w:p>
+    <w:p>
+      <w:pPr>
+        <w:pStyle w:val="a4"/>
+        <w:jc w:val="both"/>
+        <w:rPr>
+          <w:sz w:val="20"/>
+          <w:lang w:val="en-US"/>
         </w:rPr>
       </w:pPr>
     </w:p>
@@ -2562,11 +2971,23 @@
         <w:jc w:val="both"/>
         <w:rPr>
           <w:sz w:val="20"/>
+          <w:lang w:val="en-US"/>
         </w:rPr>
       </w:pPr>
-      <w:r>
+    </w:p>
+    <w:p>
+      <w:pPr>
+        <w:pStyle w:val="a4"/>
+        <w:jc w:val="both"/>
         <w:rPr>
           <w:sz w:val="20"/>
+          <w:lang w:val="en-US"/>
+        </w:rPr>
+      </w:pPr>
+      <w:r>
+        <w:rPr>
+          <w:sz w:val="20"/>
+          <w:lang w:val="en-US"/>
         </w:rPr>
         <w:t xml:space="preserve">                                                                </w:t>
       </w:r>
@@ -2990,7 +3411,6 @@
   <w:style w:type="character" w:default="1" w:styleId="a0">
     <w:name w:val="Default Paragraph Font"/>
     <w:uiPriority w:val="1"/>
-    <w:semiHidden/>
     <w:unhideWhenUsed/>
   </w:style>
   <w:style w:type="table" w:default="1" w:styleId="a1">

</xml_diff>

<commit_message>
feat: redesign transport flow, add dark mode support, and refine document generation
</commit_message>
<xml_diff>
--- a/public/templates/template.docx
+++ b/public/templates/template.docx
@@ -7,81 +7,25 @@
         <w:spacing w:after="0"/>
         <w:ind w:left="2832" w:firstLine="708"/>
         <w:rPr>
-          <w:rFonts w:ascii="Times New Roman" w:hAnsi="Times New Roman" w:cs="Times New Roman"/>
-          <w:b/>
-          <w:sz w:val="24"/>
+          <w:b/>
+          <w:sz w:val="18"/>
+          <w:szCs w:val="18"/>
         </w:rPr>
       </w:pPr>
       <w:r>
         <w:rPr>
-          <w:rFonts w:ascii="Times New Roman" w:hAnsi="Times New Roman" w:cs="Times New Roman"/>
           <w:noProof/>
-          <w:sz w:val="20"/>
         </w:rPr>
         <w:drawing>
-          <wp:anchor distT="0" distB="0" distL="114300" distR="114300" simplePos="0" relativeHeight="251660288" behindDoc="0" locked="0" layoutInCell="1" allowOverlap="1" wp14:anchorId="551D26A1" wp14:editId="3F92EB78">
-            <wp:simplePos x="0" y="0"/>
-            <wp:positionH relativeFrom="column">
-              <wp:posOffset>4057650</wp:posOffset>
-            </wp:positionH>
-            <wp:positionV relativeFrom="paragraph">
-              <wp:posOffset>146050</wp:posOffset>
-            </wp:positionV>
-            <wp:extent cx="2609850" cy="370205"/>
-            <wp:effectExtent l="0" t="0" r="0" b="0"/>
-            <wp:wrapNone/>
-            <wp:docPr id="4" name="Рисунок 4"/>
-            <wp:cNvGraphicFramePr>
-              <a:graphicFrameLocks xmlns:a="http://schemas.openxmlformats.org/drawingml/2006/main" noChangeAspect="1"/>
-            </wp:cNvGraphicFramePr>
-            <a:graphic xmlns:a="http://schemas.openxmlformats.org/drawingml/2006/main">
-              <a:graphicData uri="http://schemas.openxmlformats.org/drawingml/2006/picture">
-                <pic:pic xmlns:pic="http://schemas.openxmlformats.org/drawingml/2006/picture">
-                  <pic:nvPicPr>
-                    <pic:cNvPr id="1" name=""/>
-                    <pic:cNvPicPr/>
-                  </pic:nvPicPr>
-                  <pic:blipFill>
-                    <a:blip r:embed="rId5">
-                      <a:extLst>
-                        <a:ext uri="{28A0092B-C50C-407E-A947-70E740481C1C}">
-                          <a14:useLocalDpi xmlns:a14="http://schemas.microsoft.com/office/drawing/2010/main" val="0"/>
-                        </a:ext>
-                      </a:extLst>
-                    </a:blip>
-                    <a:stretch>
-                      <a:fillRect/>
-                    </a:stretch>
-                  </pic:blipFill>
-                  <pic:spPr>
-                    <a:xfrm>
-                      <a:off x="0" y="0"/>
-                      <a:ext cx="2609850" cy="370205"/>
-                    </a:xfrm>
-                    <a:prstGeom prst="rect">
-                      <a:avLst/>
-                    </a:prstGeom>
-                  </pic:spPr>
-                </pic:pic>
-              </a:graphicData>
-            </a:graphic>
-          </wp:anchor>
-        </w:drawing>
-      </w:r>
-      <w:r>
-        <w:rPr>
-          <w:noProof/>
-        </w:rPr>
-        <w:drawing>
-          <wp:anchor distT="0" distB="0" distL="114300" distR="114300" simplePos="0" relativeHeight="251659264" behindDoc="0" locked="0" layoutInCell="1" allowOverlap="1" wp14:anchorId="1076E42B" wp14:editId="05376F48">
+          <wp:anchor distT="0" distB="0" distL="114300" distR="114300" simplePos="0" relativeHeight="251659264" behindDoc="0" locked="0" layoutInCell="1" allowOverlap="1" wp14:anchorId="1076E42B" wp14:editId="7B589019">
             <wp:simplePos x="0" y="0"/>
             <wp:positionH relativeFrom="column">
               <wp:posOffset>15240</wp:posOffset>
             </wp:positionH>
             <wp:positionV relativeFrom="paragraph">
-              <wp:posOffset>20955</wp:posOffset>
+              <wp:posOffset>22860</wp:posOffset>
             </wp:positionV>
-            <wp:extent cx="1943735" cy="628650"/>
+            <wp:extent cx="1649232" cy="533400"/>
             <wp:effectExtent l="0" t="0" r="0" b="0"/>
             <wp:wrapNone/>
             <wp:docPr id="2" name="Рисунок 1">
@@ -110,7 +54,7 @@
                     </pic:cNvPicPr>
                   </pic:nvPicPr>
                   <pic:blipFill rotWithShape="1">
-                    <a:blip r:embed="rId6" cstate="print">
+                    <a:blip r:embed="rId5" cstate="print">
                       <a:extLst>
                         <a:ext uri="{28A0092B-C50C-407E-A947-70E740481C1C}">
                           <a14:useLocalDpi xmlns:a14="http://schemas.microsoft.com/office/drawing/2010/main" val="0"/>
@@ -123,7 +67,7 @@
                   <pic:spPr>
                     <a:xfrm>
                       <a:off x="0" y="0"/>
-                      <a:ext cx="1943735" cy="628650"/>
+                      <a:ext cx="1663929" cy="538153"/>
                     </a:xfrm>
                     <a:prstGeom prst="rect">
                       <a:avLst/>
@@ -144,6 +88,62 @@
       <w:r>
         <w:rPr>
           <w:rFonts w:ascii="Times New Roman" w:hAnsi="Times New Roman" w:cs="Times New Roman"/>
+          <w:noProof/>
+          <w:sz w:val="20"/>
+        </w:rPr>
+        <w:drawing>
+          <wp:anchor distT="0" distB="0" distL="114300" distR="114300" simplePos="0" relativeHeight="251660288" behindDoc="0" locked="0" layoutInCell="1" allowOverlap="1" wp14:anchorId="551D26A1" wp14:editId="0996B8ED">
+            <wp:simplePos x="0" y="0"/>
+            <wp:positionH relativeFrom="column">
+              <wp:posOffset>4057650</wp:posOffset>
+            </wp:positionH>
+            <wp:positionV relativeFrom="paragraph">
+              <wp:posOffset>146050</wp:posOffset>
+            </wp:positionV>
+            <wp:extent cx="2609850" cy="370205"/>
+            <wp:effectExtent l="0" t="0" r="0" b="0"/>
+            <wp:wrapNone/>
+            <wp:docPr id="4" name="Рисунок 4"/>
+            <wp:cNvGraphicFramePr>
+              <a:graphicFrameLocks xmlns:a="http://schemas.openxmlformats.org/drawingml/2006/main" noChangeAspect="1"/>
+            </wp:cNvGraphicFramePr>
+            <a:graphic xmlns:a="http://schemas.openxmlformats.org/drawingml/2006/main">
+              <a:graphicData uri="http://schemas.openxmlformats.org/drawingml/2006/picture">
+                <pic:pic xmlns:pic="http://schemas.openxmlformats.org/drawingml/2006/picture">
+                  <pic:nvPicPr>
+                    <pic:cNvPr id="1" name=""/>
+                    <pic:cNvPicPr/>
+                  </pic:nvPicPr>
+                  <pic:blipFill>
+                    <a:blip r:embed="rId6">
+                      <a:extLst>
+                        <a:ext uri="{28A0092B-C50C-407E-A947-70E740481C1C}">
+                          <a14:useLocalDpi xmlns:a14="http://schemas.microsoft.com/office/drawing/2010/main" val="0"/>
+                        </a:ext>
+                      </a:extLst>
+                    </a:blip>
+                    <a:stretch>
+                      <a:fillRect/>
+                    </a:stretch>
+                  </pic:blipFill>
+                  <pic:spPr>
+                    <a:xfrm>
+                      <a:off x="0" y="0"/>
+                      <a:ext cx="2609850" cy="370205"/>
+                    </a:xfrm>
+                    <a:prstGeom prst="rect">
+                      <a:avLst/>
+                    </a:prstGeom>
+                  </pic:spPr>
+                </pic:pic>
+              </a:graphicData>
+            </a:graphic>
+          </wp:anchor>
+        </w:drawing>
+      </w:r>
+      <w:r>
+        <w:rPr>
+          <w:rFonts w:ascii="Times New Roman" w:hAnsi="Times New Roman" w:cs="Times New Roman"/>
           <w:b/>
           <w:sz w:val="24"/>
         </w:rPr>
@@ -178,15 +178,31 @@
           <w:rFonts w:ascii="Times New Roman" w:hAnsi="Times New Roman" w:cs="Times New Roman"/>
           <w:b/>
           <w:sz w:val="24"/>
-          <w:lang w:val="en-US"/>
-        </w:rPr>
-        <w:t xml:space="preserve"> {date}</w:t>
+        </w:rPr>
+        <w:t xml:space="preserve"> {</w:t>
       </w:r>
       <w:r>
         <w:rPr>
           <w:rFonts w:ascii="Times New Roman" w:hAnsi="Times New Roman" w:cs="Times New Roman"/>
           <w:b/>
           <w:sz w:val="24"/>
+          <w:lang w:val="en-US"/>
+        </w:rPr>
+        <w:t>date</w:t>
+      </w:r>
+      <w:r>
+        <w:rPr>
+          <w:rFonts w:ascii="Times New Roman" w:hAnsi="Times New Roman" w:cs="Times New Roman"/>
+          <w:b/>
+          <w:sz w:val="24"/>
+        </w:rPr>
+        <w:t>}</w:t>
+      </w:r>
+      <w:r>
+        <w:rPr>
+          <w:rFonts w:ascii="Times New Roman" w:hAnsi="Times New Roman" w:cs="Times New Roman"/>
+          <w:b/>
+          <w:sz w:val="24"/>
         </w:rPr>
         <w:t>.</w:t>
       </w:r>
@@ -219,7 +235,6 @@
           <w:rFonts w:ascii="Times New Roman" w:hAnsi="Times New Roman" w:cs="Times New Roman"/>
           <w:b/>
           <w:sz w:val="24"/>
-          <w:lang w:val="en-US"/>
         </w:rPr>
         <w:t xml:space="preserve">        </w:t>
       </w:r>
@@ -235,16 +250,26 @@
     <w:p>
       <w:pPr>
         <w:spacing w:after="0"/>
-        <w:jc w:val="right"/>
+        <w:ind w:left="2832" w:firstLine="708"/>
         <w:rPr>
           <w:rFonts w:ascii="Times New Roman" w:hAnsi="Times New Roman" w:cs="Times New Roman"/>
-          <w:sz w:val="20"/>
+          <w:b/>
+          <w:sz w:val="24"/>
+          <w:lang w:val="en-US"/>
         </w:rPr>
       </w:pPr>
+      <w:r>
+        <w:rPr>
+          <w:rFonts w:ascii="Times New Roman" w:hAnsi="Times New Roman" w:cs="Times New Roman"/>
+          <w:b/>
+          <w:sz w:val="24"/>
+          <w:lang w:val="en-US"/>
+        </w:rPr>
+        <w:t>{number}</w:t>
+      </w:r>
     </w:p>
     <w:p>
       <w:pPr>
-        <w:jc w:val="right"/>
         <w:rPr>
           <w:rFonts w:ascii="Times New Roman" w:hAnsi="Times New Roman" w:cs="Times New Roman"/>
           <w:sz w:val="20"/>
@@ -1378,49 +1403,130 @@
               <w:rPr>
                 <w:sz w:val="24"/>
                 <w:szCs w:val="24"/>
-              </w:rPr>
-            </w:pPr>
-            <w:r>
-              <w:rPr>
-                <w:sz w:val="24"/>
-                <w:szCs w:val="18"/>
-              </w:rPr>
-              <w:t xml:space="preserve">Крепление, </w:t>
+                <w:lang w:val="kk-KZ"/>
+              </w:rPr>
+            </w:pPr>
+            <w:r>
+              <w:rPr>
+                <w:sz w:val="24"/>
+                <w:szCs w:val="18"/>
+                <w:lang w:val="kk-KZ"/>
+              </w:rPr>
+              <w:t>Вид транспорта</w:t>
+            </w:r>
+          </w:p>
+        </w:tc>
+        <w:tc>
+          <w:tcPr>
+            <w:tcW w:w="6917" w:type="dxa"/>
+          </w:tcPr>
+          <w:p>
+            <w:pPr>
+              <w:tabs>
+                <w:tab w:val="left" w:pos="0"/>
+              </w:tabs>
+              <w:jc w:val="both"/>
+              <w:rPr>
+                <w:sz w:val="24"/>
+                <w:szCs w:val="24"/>
+                <w:lang w:val="en-US"/>
+              </w:rPr>
+            </w:pPr>
+            <w:r>
+              <w:rPr>
+                <w:sz w:val="24"/>
+                <w:szCs w:val="24"/>
+                <w:lang w:val="en-US"/>
+              </w:rPr>
+              <w:t>{</w:t>
             </w:r>
             <w:proofErr w:type="spellStart"/>
             <w:r>
               <w:rPr>
                 <w:sz w:val="24"/>
-                <w:szCs w:val="18"/>
-              </w:rPr>
-              <w:t>штабелирование</w:t>
+                <w:szCs w:val="24"/>
+                <w:lang w:val="en-US"/>
+              </w:rPr>
+              <w:t>transportType</w:t>
             </w:r>
             <w:proofErr w:type="spellEnd"/>
-          </w:p>
-        </w:tc>
-        <w:tc>
-          <w:tcPr>
-            <w:tcW w:w="6917" w:type="dxa"/>
-          </w:tcPr>
-          <w:p>
-            <w:pPr>
-              <w:tabs>
-                <w:tab w:val="left" w:pos="0"/>
-              </w:tabs>
-              <w:jc w:val="both"/>
-              <w:rPr>
-                <w:sz w:val="24"/>
-                <w:szCs w:val="24"/>
-                <w:lang w:val="en-US"/>
-              </w:rPr>
-            </w:pPr>
-            <w:r>
-              <w:rPr>
-                <w:sz w:val="24"/>
-                <w:szCs w:val="24"/>
-                <w:lang w:val="en-US"/>
-              </w:rPr>
-              <w:t>{fastening}</w:t>
+            <w:r>
+              <w:rPr>
+                <w:sz w:val="24"/>
+                <w:szCs w:val="24"/>
+                <w:lang w:val="en-US"/>
+              </w:rPr>
+              <w:t>}</w:t>
+            </w:r>
+            <w:r>
+              <w:rPr>
+                <w:sz w:val="24"/>
+                <w:szCs w:val="24"/>
+                <w:lang w:val="en-US"/>
+              </w:rPr>
+              <w:t xml:space="preserve"> {#has_</w:t>
+            </w:r>
+            <w:proofErr w:type="gramStart"/>
+            <w:r>
+              <w:rPr>
+                <w:sz w:val="24"/>
+                <w:szCs w:val="24"/>
+                <w:lang w:val="en-US"/>
+              </w:rPr>
+              <w:t>trailer}</w:t>
+            </w:r>
+            <w:r>
+              <w:rPr>
+                <w:sz w:val="24"/>
+                <w:szCs w:val="24"/>
+                <w:lang w:val="kk-KZ"/>
+              </w:rPr>
+              <w:t>Прицеп</w:t>
+            </w:r>
+            <w:proofErr w:type="gramEnd"/>
+            <w:r>
+              <w:rPr>
+                <w:sz w:val="24"/>
+                <w:szCs w:val="24"/>
+                <w:lang w:val="en-US"/>
+              </w:rPr>
+              <w:t>:{</w:t>
+            </w:r>
+            <w:proofErr w:type="spellStart"/>
+            <w:r>
+              <w:rPr>
+                <w:sz w:val="24"/>
+                <w:szCs w:val="24"/>
+                <w:lang w:val="en-US"/>
+              </w:rPr>
+              <w:t>trailer_number</w:t>
+            </w:r>
+            <w:proofErr w:type="spellEnd"/>
+            <w:r>
+              <w:rPr>
+                <w:sz w:val="24"/>
+                <w:szCs w:val="24"/>
+                <w:lang w:val="en-US"/>
+              </w:rPr>
+              <w:t>}{/</w:t>
+            </w:r>
+            <w:proofErr w:type="spellStart"/>
+            <w:r>
+              <w:rPr>
+                <w:sz w:val="24"/>
+                <w:szCs w:val="24"/>
+                <w:lang w:val="en-US"/>
+              </w:rPr>
+              <w:t>has_trailer</w:t>
+            </w:r>
+            <w:proofErr w:type="spellEnd"/>
+            <w:r>
+              <w:rPr>
+                <w:sz w:val="24"/>
+                <w:szCs w:val="24"/>
+                <w:lang w:val="en-US"/>
+              </w:rPr>
+              <w:t>}</w:t>
             </w:r>
           </w:p>
         </w:tc>
@@ -1441,6 +1547,7 @@
                 <w:b/>
                 <w:sz w:val="24"/>
                 <w:szCs w:val="18"/>
+                <w:lang w:val="en-US"/>
               </w:rPr>
             </w:pPr>
           </w:p>
@@ -2420,19 +2527,24 @@
       <w:pPr>
         <w:pStyle w:val="a4"/>
         <w:jc w:val="both"/>
-        <w:rPr>
-          <w:sz w:val="20"/>
-        </w:rPr>
       </w:pPr>
     </w:p>
     <w:p>
       <w:pPr>
         <w:pStyle w:val="a4"/>
         <w:jc w:val="both"/>
-        <w:rPr>
-          <w:b/>
-          <w:sz w:val="20"/>
-        </w:rPr>
+      </w:pPr>
+    </w:p>
+    <w:p>
+      <w:pPr>
+        <w:pStyle w:val="a4"/>
+        <w:jc w:val="both"/>
+      </w:pPr>
+    </w:p>
+    <w:p>
+      <w:pPr>
+        <w:pStyle w:val="a4"/>
+        <w:jc w:val="both"/>
         <w:sectPr>
           <w:pgSz w:w="11906" w:h="16838"/>
           <w:pgMar w:top="720" w:right="720" w:bottom="568" w:left="720" w:header="708" w:footer="708" w:gutter="0"/>
@@ -2454,6 +2566,135 @@
         <w:rPr>
           <w:b/>
           <w:sz w:val="24"/>
+          <w:lang w:val="en-US"/>
+        </w:rPr>
+      </w:pPr>
+      <w:r>
+        <w:rPr>
+          <w:b/>
+          <w:sz w:val="24"/>
+        </w:rPr>
+        <w:t>Заказчик</w:t>
+      </w:r>
+      <w:r>
+        <w:rPr>
+          <w:b/>
+          <w:sz w:val="24"/>
+          <w:lang w:val="en-US"/>
+        </w:rPr>
+        <w:t>:</w:t>
+      </w:r>
+    </w:p>
+    <w:p>
+      <w:pPr>
+        <w:pStyle w:val="a4"/>
+        <w:jc w:val="both"/>
+        <w:rPr>
+          <w:b/>
+          <w:bCs/>
+          <w:sz w:val="20"/>
+          <w:lang w:val="en-US"/>
+        </w:rPr>
+      </w:pPr>
+      <w:r>
+        <w:rPr>
+          <w:b/>
+          <w:bCs/>
+          <w:sz w:val="24"/>
+          <w:lang w:val="en-US"/>
+        </w:rPr>
+        <w:t>{</w:t>
+      </w:r>
+      <w:proofErr w:type="spellStart"/>
+      <w:r>
+        <w:rPr>
+          <w:b/>
+          <w:bCs/>
+          <w:sz w:val="24"/>
+          <w:lang w:val="en-US"/>
+        </w:rPr>
+        <w:t>customer</w:t>
+      </w:r>
+      <w:r>
+        <w:rPr>
+          <w:b/>
+          <w:bCs/>
+          <w:sz w:val="24"/>
+          <w:lang w:val="en-US"/>
+        </w:rPr>
+        <w:t>_</w:t>
+      </w:r>
+      <w:r>
+        <w:rPr>
+          <w:b/>
+          <w:bCs/>
+          <w:sz w:val="24"/>
+          <w:lang w:val="en-US"/>
+        </w:rPr>
+        <w:t>company</w:t>
+      </w:r>
+      <w:proofErr w:type="spellEnd"/>
+      <w:r>
+        <w:rPr>
+          <w:b/>
+          <w:bCs/>
+          <w:sz w:val="24"/>
+          <w:lang w:val="en-US"/>
+        </w:rPr>
+        <w:t>}</w:t>
+      </w:r>
+    </w:p>
+    <w:p>
+      <w:pPr>
+        <w:pStyle w:val="a4"/>
+        <w:jc w:val="both"/>
+        <w:rPr>
+          <w:b/>
+          <w:bCs/>
+          <w:sz w:val="24"/>
+          <w:szCs w:val="28"/>
+          <w:lang w:val="en-US"/>
+        </w:rPr>
+      </w:pPr>
+      <w:r>
+        <w:rPr>
+          <w:b/>
+          <w:bCs/>
+          <w:sz w:val="24"/>
+          <w:szCs w:val="28"/>
+          <w:lang w:val="en-US"/>
+        </w:rPr>
+        <w:t>{</w:t>
+      </w:r>
+      <w:proofErr w:type="spellStart"/>
+      <w:r>
+        <w:rPr>
+          <w:b/>
+          <w:bCs/>
+          <w:sz w:val="24"/>
+          <w:szCs w:val="28"/>
+          <w:lang w:val="en-US"/>
+        </w:rPr>
+        <w:t>customer_director_name</w:t>
+      </w:r>
+      <w:proofErr w:type="spellEnd"/>
+      <w:r>
+        <w:rPr>
+          <w:b/>
+          <w:bCs/>
+          <w:sz w:val="24"/>
+          <w:szCs w:val="28"/>
+          <w:lang w:val="en-US"/>
+        </w:rPr>
+        <w:t>}</w:t>
+      </w:r>
+    </w:p>
+    <w:p>
+      <w:pPr>
+        <w:pStyle w:val="a4"/>
+        <w:jc w:val="both"/>
+        <w:rPr>
+          <w:lang w:val="en-US"/>
         </w:rPr>
       </w:pPr>
     </w:p>
@@ -2462,25 +2703,61 @@
         <w:pStyle w:val="a4"/>
         <w:jc w:val="both"/>
         <w:rPr>
-          <w:b/>
-          <w:sz w:val="24"/>
+          <w:sz w:val="20"/>
           <w:lang w:val="en-US"/>
         </w:rPr>
       </w:pPr>
       <w:r>
         <w:rPr>
-          <w:b/>
-          <w:sz w:val="24"/>
-        </w:rPr>
-        <w:t>Заказчик</w:t>
-      </w:r>
-      <w:r>
-        <w:rPr>
-          <w:b/>
-          <w:sz w:val="24"/>
-          <w:lang w:val="en-US"/>
-        </w:rPr>
-        <w:t>:</w:t>
+          <w:lang w:val="en-US"/>
+        </w:rPr>
+        <w:t>________________</w:t>
+      </w:r>
+      <w:r>
+        <w:rPr>
+          <w:lang w:val="en-US"/>
+        </w:rPr>
+        <w:t>___________</w:t>
+      </w:r>
+      <w:r>
+        <w:rPr>
+          <w:sz w:val="20"/>
+          <w:lang w:val="en-US"/>
+        </w:rPr>
+        <w:t xml:space="preserve">            </w:t>
+      </w:r>
+      <w:r>
+        <w:rPr>
+          <w:sz w:val="24"/>
+        </w:rPr>
+        <w:t>М</w:t>
+      </w:r>
+      <w:r>
+        <w:rPr>
+          <w:sz w:val="24"/>
+          <w:lang w:val="en-US"/>
+        </w:rPr>
+        <w:t>.</w:t>
+      </w:r>
+      <w:r>
+        <w:rPr>
+          <w:sz w:val="24"/>
+        </w:rPr>
+        <w:t>П</w:t>
+      </w:r>
+      <w:r>
+        <w:rPr>
+          <w:sz w:val="24"/>
+          <w:lang w:val="en-US"/>
+        </w:rPr>
+        <w:t>.</w:t>
+      </w:r>
+      <w:r>
+        <w:rPr>
+          <w:sz w:val="20"/>
+          <w:lang w:val="en-US"/>
+        </w:rPr>
+        <w:t xml:space="preserve">             </w:t>
       </w:r>
     </w:p>
     <w:p>
@@ -2488,58 +2765,36 @@
         <w:pStyle w:val="a4"/>
         <w:jc w:val="both"/>
         <w:rPr>
-          <w:b/>
-          <w:bCs/>
           <w:sz w:val="20"/>
           <w:lang w:val="en-US"/>
         </w:rPr>
       </w:pPr>
       <w:r>
         <w:rPr>
-          <w:b/>
-          <w:bCs/>
-          <w:sz w:val="24"/>
-          <w:lang w:val="en-US"/>
-        </w:rPr>
-        <w:t>{</w:t>
-      </w:r>
-      <w:proofErr w:type="spellStart"/>
-      <w:r>
-        <w:rPr>
-          <w:b/>
-          <w:bCs/>
-          <w:sz w:val="24"/>
-          <w:lang w:val="en-US"/>
-        </w:rPr>
-        <w:t>customer</w:t>
-      </w:r>
-      <w:r>
-        <w:rPr>
-          <w:b/>
-          <w:bCs/>
-          <w:sz w:val="24"/>
-          <w:lang w:val="en-US"/>
-        </w:rPr>
-        <w:t>_</w:t>
-      </w:r>
-      <w:r>
-        <w:rPr>
-          <w:b/>
-          <w:bCs/>
-          <w:sz w:val="24"/>
-          <w:lang w:val="en-US"/>
-        </w:rPr>
-        <w:t>company</w:t>
-      </w:r>
-      <w:proofErr w:type="spellEnd"/>
-      <w:r>
-        <w:rPr>
-          <w:b/>
-          <w:bCs/>
-          <w:sz w:val="24"/>
-          <w:lang w:val="en-US"/>
-        </w:rPr>
-        <w:t>}</w:t>
+          <w:sz w:val="20"/>
+          <w:lang w:val="en-US"/>
+        </w:rPr>
+        <w:t xml:space="preserve">                    </w:t>
+      </w:r>
+      <w:r>
+        <w:rPr>
+          <w:sz w:val="20"/>
+          <w:lang w:val="en-US"/>
+        </w:rPr>
+        <w:t>(</w:t>
+      </w:r>
+      <w:r>
+        <w:rPr>
+          <w:sz w:val="20"/>
+        </w:rPr>
+        <w:t>подпись</w:t>
+      </w:r>
+      <w:r>
+        <w:rPr>
+          <w:sz w:val="20"/>
+          <w:lang w:val="en-US"/>
+        </w:rPr>
+        <w:t xml:space="preserve">)                                                                                                                                                </w:t>
       </w:r>
     </w:p>
     <w:p>
@@ -2547,47 +2802,7 @@
         <w:pStyle w:val="a4"/>
         <w:jc w:val="both"/>
         <w:rPr>
-          <w:b/>
-          <w:bCs/>
-          <w:sz w:val="24"/>
-          <w:szCs w:val="28"/>
-        </w:rPr>
-      </w:pPr>
-      <w:r>
-        <w:rPr>
-          <w:b/>
-          <w:bCs/>
-          <w:sz w:val="24"/>
-          <w:szCs w:val="28"/>
-        </w:rPr>
-        <w:t>{</w:t>
-      </w:r>
-      <w:proofErr w:type="spellStart"/>
-      <w:r>
-        <w:rPr>
-          <w:b/>
-          <w:bCs/>
-          <w:sz w:val="24"/>
-          <w:szCs w:val="28"/>
-        </w:rPr>
-        <w:t>customer_director_name</w:t>
-      </w:r>
-      <w:proofErr w:type="spellEnd"/>
-      <w:r>
-        <w:rPr>
-          <w:b/>
-          <w:bCs/>
-          <w:sz w:val="24"/>
-          <w:szCs w:val="28"/>
-        </w:rPr>
-        <w:t>}</w:t>
-      </w:r>
-    </w:p>
-    <w:p>
-      <w:pPr>
-        <w:pStyle w:val="a4"/>
-        <w:jc w:val="both"/>
-        <w:rPr>
+          <w:sz w:val="20"/>
           <w:lang w:val="en-US"/>
         </w:rPr>
       </w:pPr>
@@ -2597,106 +2812,8 @@
         <w:pStyle w:val="a4"/>
         <w:jc w:val="both"/>
         <w:rPr>
-          <w:sz w:val="20"/>
-          <w:lang w:val="en-US"/>
-        </w:rPr>
-      </w:pPr>
-      <w:r>
-        <w:rPr>
-          <w:lang w:val="en-US"/>
-        </w:rPr>
-        <w:t>________________</w:t>
-      </w:r>
-      <w:r>
-        <w:rPr>
-          <w:lang w:val="en-US"/>
-        </w:rPr>
-        <w:t>___________</w:t>
-      </w:r>
-      <w:r>
-        <w:rPr>
-          <w:sz w:val="20"/>
-          <w:lang w:val="en-US"/>
-        </w:rPr>
-        <w:t xml:space="preserve">            </w:t>
-      </w:r>
-      <w:r>
-        <w:rPr>
-          <w:sz w:val="24"/>
-        </w:rPr>
-        <w:t>М</w:t>
-      </w:r>
-      <w:r>
-        <w:rPr>
-          <w:sz w:val="24"/>
-          <w:lang w:val="en-US"/>
-        </w:rPr>
-        <w:t>.</w:t>
-      </w:r>
-      <w:r>
-        <w:rPr>
-          <w:sz w:val="24"/>
-        </w:rPr>
-        <w:t>П</w:t>
-      </w:r>
-      <w:r>
-        <w:rPr>
-          <w:sz w:val="24"/>
-          <w:lang w:val="en-US"/>
-        </w:rPr>
-        <w:t>.</w:t>
-      </w:r>
-      <w:r>
-        <w:rPr>
-          <w:sz w:val="20"/>
-          <w:lang w:val="en-US"/>
-        </w:rPr>
-        <w:t xml:space="preserve">             </w:t>
-      </w:r>
-    </w:p>
-    <w:p>
-      <w:pPr>
-        <w:pStyle w:val="a4"/>
-        <w:jc w:val="both"/>
-        <w:rPr>
-          <w:sz w:val="20"/>
-          <w:lang w:val="en-US"/>
-        </w:rPr>
-      </w:pPr>
-      <w:r>
-        <w:rPr>
-          <w:sz w:val="20"/>
-          <w:lang w:val="en-US"/>
-        </w:rPr>
-        <w:t xml:space="preserve">                    </w:t>
-      </w:r>
-      <w:r>
-        <w:rPr>
-          <w:sz w:val="20"/>
-          <w:lang w:val="en-US"/>
-        </w:rPr>
-        <w:t>(</w:t>
-      </w:r>
-      <w:r>
-        <w:rPr>
-          <w:sz w:val="20"/>
-        </w:rPr>
-        <w:t>подпись</w:t>
-      </w:r>
-      <w:r>
-        <w:rPr>
-          <w:sz w:val="20"/>
-          <w:lang w:val="en-US"/>
-        </w:rPr>
-        <w:t xml:space="preserve">)                                                                                                                                                </w:t>
-      </w:r>
-    </w:p>
-    <w:p>
-      <w:pPr>
-        <w:pStyle w:val="a4"/>
-        <w:jc w:val="both"/>
-        <w:rPr>
-          <w:sz w:val="20"/>
+          <w:b/>
+          <w:sz w:val="24"/>
           <w:lang w:val="en-US"/>
         </w:rPr>
       </w:pPr>
@@ -2706,7 +2823,8 @@
         <w:pStyle w:val="a4"/>
         <w:jc w:val="both"/>
         <w:rPr>
-          <w:sz w:val="20"/>
+          <w:b/>
+          <w:sz w:val="24"/>
           <w:lang w:val="en-US"/>
         </w:rPr>
       </w:pPr>
@@ -2718,6 +2836,137 @@
         <w:rPr>
           <w:b/>
           <w:sz w:val="24"/>
+          <w:lang w:val="en-US"/>
+        </w:rPr>
+      </w:pPr>
+      <w:r>
+        <w:rPr>
+          <w:b/>
+          <w:sz w:val="24"/>
+        </w:rPr>
+        <w:t>Экспедитор</w:t>
+      </w:r>
+      <w:r>
+        <w:rPr>
+          <w:b/>
+          <w:sz w:val="24"/>
+          <w:lang w:val="en-US"/>
+        </w:rPr>
+        <w:t>:</w:t>
+      </w:r>
+    </w:p>
+    <w:p>
+      <w:pPr>
+        <w:pStyle w:val="a4"/>
+        <w:jc w:val="both"/>
+        <w:rPr>
+          <w:b/>
+          <w:sz w:val="24"/>
+          <w:lang w:val="en-US"/>
+        </w:rPr>
+      </w:pPr>
+      <w:r>
+        <w:rPr>
+          <w:b/>
+          <w:sz w:val="24"/>
+          <w:lang w:val="en-US"/>
+        </w:rPr>
+        <w:t>{</w:t>
+      </w:r>
+      <w:proofErr w:type="spellStart"/>
+      <w:r>
+        <w:rPr>
+          <w:b/>
+          <w:sz w:val="24"/>
+          <w:lang w:val="en-US"/>
+        </w:rPr>
+        <w:t>expeditor</w:t>
+      </w:r>
+      <w:r>
+        <w:rPr>
+          <w:b/>
+          <w:sz w:val="24"/>
+          <w:lang w:val="en-US"/>
+        </w:rPr>
+        <w:t>_</w:t>
+      </w:r>
+      <w:r>
+        <w:rPr>
+          <w:b/>
+          <w:sz w:val="24"/>
+          <w:lang w:val="en-US"/>
+        </w:rPr>
+        <w:t>name</w:t>
+      </w:r>
+      <w:proofErr w:type="spellEnd"/>
+      <w:r>
+        <w:rPr>
+          <w:lang w:val="en-US"/>
+        </w:rPr>
+        <w:t>}</w:t>
+      </w:r>
+    </w:p>
+    <w:p>
+      <w:pPr>
+        <w:pStyle w:val="a4"/>
+        <w:jc w:val="both"/>
+        <w:rPr>
+          <w:b/>
+          <w:sz w:val="24"/>
+          <w:lang w:val="en-US"/>
+        </w:rPr>
+      </w:pPr>
+      <w:r>
+        <w:rPr>
+          <w:b/>
+          <w:sz w:val="24"/>
+          <w:lang w:val="en-US"/>
+        </w:rPr>
+        <w:t>{</w:t>
+      </w:r>
+      <w:proofErr w:type="spellStart"/>
+      <w:r>
+        <w:rPr>
+          <w:b/>
+          <w:sz w:val="24"/>
+          <w:lang w:val="en-US"/>
+        </w:rPr>
+        <w:t>expeditor_director</w:t>
+      </w:r>
+      <w:r>
+        <w:rPr>
+          <w:b/>
+          <w:sz w:val="24"/>
+          <w:lang w:val="en-US"/>
+        </w:rPr>
+        <w:t>_</w:t>
+      </w:r>
+      <w:r>
+        <w:rPr>
+          <w:b/>
+          <w:sz w:val="24"/>
+          <w:lang w:val="en-US"/>
+        </w:rPr>
+        <w:t>name</w:t>
+      </w:r>
+      <w:proofErr w:type="spellEnd"/>
+      <w:r>
+        <w:rPr>
+          <w:b/>
+          <w:sz w:val="24"/>
+          <w:lang w:val="en-US"/>
+        </w:rPr>
+        <w:t>}</w:t>
+      </w:r>
+    </w:p>
+    <w:p>
+      <w:pPr>
+        <w:pStyle w:val="a4"/>
+        <w:jc w:val="both"/>
+        <w:rPr>
+          <w:b/>
+          <w:sz w:val="24"/>
+          <w:lang w:val="en-US"/>
         </w:rPr>
       </w:pPr>
     </w:p>
@@ -2728,6 +2977,89 @@
         <w:rPr>
           <w:b/>
           <w:sz w:val="24"/>
+          <w:lang w:val="en-US"/>
+        </w:rPr>
+      </w:pPr>
+      <w:r>
+        <w:rPr>
+          <w:b/>
+          <w:sz w:val="24"/>
+          <w:lang w:val="en-US"/>
+        </w:rPr>
+        <w:t>____________________________</w:t>
+      </w:r>
+      <w:r>
+        <w:rPr>
+          <w:b/>
+          <w:sz w:val="24"/>
+          <w:lang w:val="en-US"/>
+        </w:rPr>
+        <w:t xml:space="preserve">      </w:t>
+      </w:r>
+      <w:r>
+        <w:rPr>
+          <w:sz w:val="24"/>
+        </w:rPr>
+        <w:t>М</w:t>
+      </w:r>
+      <w:r>
+        <w:rPr>
+          <w:sz w:val="24"/>
+          <w:lang w:val="en-US"/>
+        </w:rPr>
+        <w:t>.</w:t>
+      </w:r>
+      <w:r>
+        <w:rPr>
+          <w:sz w:val="24"/>
+        </w:rPr>
+        <w:t>П</w:t>
+      </w:r>
+      <w:r>
+        <w:rPr>
+          <w:sz w:val="24"/>
+          <w:lang w:val="en-US"/>
+        </w:rPr>
+        <w:t>.</w:t>
+      </w:r>
+    </w:p>
+    <w:p>
+      <w:pPr>
+        <w:pStyle w:val="a4"/>
+        <w:jc w:val="both"/>
+        <w:rPr>
+          <w:sz w:val="20"/>
+          <w:lang w:val="en-US"/>
+        </w:rPr>
+      </w:pPr>
+      <w:r>
+        <w:rPr>
+          <w:sz w:val="20"/>
+          <w:lang w:val="en-US"/>
+        </w:rPr>
+        <w:t xml:space="preserve">                         (</w:t>
+      </w:r>
+      <w:r>
+        <w:rPr>
+          <w:sz w:val="20"/>
+        </w:rPr>
+        <w:t>подпись</w:t>
+      </w:r>
+      <w:r>
+        <w:rPr>
+          <w:sz w:val="20"/>
+          <w:lang w:val="en-US"/>
+        </w:rPr>
+        <w:t xml:space="preserve">)                                                                                                                                                </w:t>
+      </w:r>
+    </w:p>
+    <w:p>
+      <w:pPr>
+        <w:pStyle w:val="a4"/>
+        <w:jc w:val="both"/>
+        <w:rPr>
+          <w:sz w:val="20"/>
+          <w:lang w:val="en-US"/>
         </w:rPr>
       </w:pPr>
     </w:p>
@@ -2736,259 +3068,16 @@
         <w:pStyle w:val="a4"/>
         <w:jc w:val="both"/>
         <w:rPr>
-          <w:b/>
-          <w:sz w:val="24"/>
+          <w:sz w:val="20"/>
           <w:lang w:val="en-US"/>
         </w:rPr>
       </w:pPr>
       <w:r>
         <w:rPr>
-          <w:b/>
-          <w:sz w:val="24"/>
-        </w:rPr>
-        <w:t>Экспедитор</w:t>
-      </w:r>
-      <w:r>
-        <w:rPr>
-          <w:b/>
-          <w:sz w:val="24"/>
-          <w:lang w:val="en-US"/>
-        </w:rPr>
-        <w:t>:</w:t>
-      </w:r>
-    </w:p>
-    <w:p>
-      <w:pPr>
-        <w:pStyle w:val="a4"/>
-        <w:jc w:val="both"/>
-        <w:rPr>
-          <w:b/>
-          <w:sz w:val="24"/>
-          <w:lang w:val="en-US"/>
-        </w:rPr>
-      </w:pPr>
-      <w:r>
-        <w:rPr>
-          <w:b/>
-          <w:sz w:val="24"/>
-          <w:lang w:val="en-US"/>
-        </w:rPr>
-        <w:t>{</w:t>
-      </w:r>
-      <w:proofErr w:type="spellStart"/>
-      <w:r>
-        <w:rPr>
-          <w:b/>
-          <w:sz w:val="24"/>
-          <w:lang w:val="en-US"/>
-        </w:rPr>
-        <w:t>expeditor</w:t>
-      </w:r>
-      <w:r>
-        <w:rPr>
-          <w:b/>
-          <w:sz w:val="24"/>
-          <w:lang w:val="en-US"/>
-        </w:rPr>
-        <w:t>_</w:t>
-      </w:r>
-      <w:r>
-        <w:rPr>
-          <w:b/>
-          <w:sz w:val="24"/>
-          <w:lang w:val="en-US"/>
-        </w:rPr>
-        <w:t>name</w:t>
-      </w:r>
-      <w:proofErr w:type="spellEnd"/>
-      <w:r>
-        <w:rPr>
-          <w:lang w:val="en-US"/>
-        </w:rPr>
-        <w:t>}</w:t>
-      </w:r>
-    </w:p>
-    <w:p>
-      <w:pPr>
-        <w:pStyle w:val="a4"/>
-        <w:jc w:val="both"/>
-        <w:rPr>
-          <w:b/>
-          <w:sz w:val="24"/>
-          <w:lang w:val="en-US"/>
-        </w:rPr>
-      </w:pPr>
-      <w:r>
-        <w:rPr>
-          <w:b/>
-          <w:sz w:val="24"/>
-          <w:lang w:val="en-US"/>
-        </w:rPr>
-        <w:t>{</w:t>
-      </w:r>
-      <w:proofErr w:type="spellStart"/>
-      <w:r>
-        <w:rPr>
-          <w:b/>
-          <w:sz w:val="24"/>
-          <w:lang w:val="en-US"/>
-        </w:rPr>
-        <w:t>expeditor_director</w:t>
-      </w:r>
-      <w:r>
-        <w:rPr>
-          <w:b/>
-          <w:sz w:val="24"/>
-          <w:lang w:val="en-US"/>
-        </w:rPr>
-        <w:t>_</w:t>
-      </w:r>
-      <w:r>
-        <w:rPr>
-          <w:b/>
-          <w:sz w:val="24"/>
-          <w:lang w:val="en-US"/>
-        </w:rPr>
-        <w:t>name</w:t>
-      </w:r>
-      <w:proofErr w:type="spellEnd"/>
-      <w:r>
-        <w:rPr>
-          <w:b/>
-          <w:sz w:val="24"/>
-          <w:lang w:val="en-US"/>
-        </w:rPr>
-        <w:t>}</w:t>
-      </w:r>
-    </w:p>
-    <w:p>
-      <w:pPr>
-        <w:pStyle w:val="a4"/>
-        <w:jc w:val="both"/>
-        <w:rPr>
-          <w:b/>
-          <w:sz w:val="24"/>
-          <w:lang w:val="en-US"/>
-        </w:rPr>
-      </w:pPr>
-    </w:p>
-    <w:p>
-      <w:pPr>
-        <w:pStyle w:val="a4"/>
-        <w:jc w:val="both"/>
-        <w:rPr>
-          <w:b/>
-          <w:sz w:val="24"/>
-          <w:lang w:val="en-US"/>
-        </w:rPr>
-      </w:pPr>
-      <w:r>
-        <w:rPr>
-          <w:b/>
-          <w:sz w:val="24"/>
-          <w:lang w:val="en-US"/>
-        </w:rPr>
-        <w:t>____________________________</w:t>
-      </w:r>
-      <w:r>
-        <w:rPr>
-          <w:b/>
-          <w:sz w:val="24"/>
-          <w:lang w:val="en-US"/>
-        </w:rPr>
-        <w:t xml:space="preserve">      </w:t>
-      </w:r>
-      <w:r>
-        <w:rPr>
-          <w:sz w:val="24"/>
-        </w:rPr>
-        <w:t>М</w:t>
-      </w:r>
-      <w:r>
-        <w:rPr>
-          <w:sz w:val="24"/>
-          <w:lang w:val="en-US"/>
-        </w:rPr>
-        <w:t>.</w:t>
-      </w:r>
-      <w:r>
-        <w:rPr>
-          <w:sz w:val="24"/>
-        </w:rPr>
-        <w:t>П</w:t>
-      </w:r>
-      <w:r>
-        <w:rPr>
-          <w:sz w:val="24"/>
-          <w:lang w:val="en-US"/>
-        </w:rPr>
-        <w:t>.</w:t>
-      </w:r>
-    </w:p>
-    <w:p>
-      <w:pPr>
-        <w:pStyle w:val="a4"/>
-        <w:jc w:val="both"/>
-        <w:rPr>
           <w:sz w:val="20"/>
           <w:lang w:val="en-US"/>
         </w:rPr>
-      </w:pPr>
-      <w:r>
-        <w:rPr>
-          <w:sz w:val="20"/>
-          <w:lang w:val="en-US"/>
-        </w:rPr>
-        <w:t xml:space="preserve">                         (</w:t>
-      </w:r>
-      <w:r>
-        <w:rPr>
-          <w:sz w:val="20"/>
-        </w:rPr>
-        <w:t>подпись</w:t>
-      </w:r>
-      <w:r>
-        <w:rPr>
-          <w:sz w:val="20"/>
-          <w:lang w:val="en-US"/>
-        </w:rPr>
-        <w:t xml:space="preserve">)                                                                                                                                                </w:t>
-      </w:r>
-    </w:p>
-    <w:p>
-      <w:pPr>
-        <w:pStyle w:val="a4"/>
-        <w:jc w:val="both"/>
-        <w:rPr>
-          <w:sz w:val="20"/>
-          <w:lang w:val="en-US"/>
-        </w:rPr>
-      </w:pPr>
-    </w:p>
-    <w:p>
-      <w:pPr>
-        <w:pStyle w:val="a4"/>
-        <w:jc w:val="both"/>
-        <w:rPr>
-          <w:sz w:val="20"/>
-          <w:lang w:val="en-US"/>
-        </w:rPr>
-      </w:pPr>
-    </w:p>
-    <w:p>
-      <w:pPr>
-        <w:pStyle w:val="a4"/>
-        <w:jc w:val="both"/>
-        <w:rPr>
-          <w:sz w:val="20"/>
-          <w:lang w:val="en-US"/>
-        </w:rPr>
-      </w:pPr>
-      <w:r>
-        <w:rPr>
-          <w:sz w:val="20"/>
-          <w:lang w:val="en-US"/>
-        </w:rPr>
+        <w:lastRenderedPageBreak/>
         <w:t xml:space="preserve">                                                                </w:t>
       </w:r>
     </w:p>

</xml_diff>

<commit_message>
feat: company logos, webp support, and duplicate request prevention
</commit_message>
<xml_diff>
--- a/public/templates/template.docx
+++ b/public/templates/template.docx
@@ -2,277 +2,214 @@
 <file path=word/document.xml><?xml version="1.0" encoding="utf-8"?>
 <w:document xmlns:wpc="http://schemas.microsoft.com/office/word/2010/wordprocessingCanvas" xmlns:cx="http://schemas.microsoft.com/office/drawing/2014/chartex" xmlns:cx1="http://schemas.microsoft.com/office/drawing/2015/9/8/chartex" xmlns:cx2="http://schemas.microsoft.com/office/drawing/2015/10/21/chartex" xmlns:cx3="http://schemas.microsoft.com/office/drawing/2016/5/9/chartex" xmlns:cx4="http://schemas.microsoft.com/office/drawing/2016/5/10/chartex" xmlns:cx5="http://schemas.microsoft.com/office/drawing/2016/5/11/chartex" xmlns:cx6="http://schemas.microsoft.com/office/drawing/2016/5/12/chartex" xmlns:cx7="http://schemas.microsoft.com/office/drawing/2016/5/13/chartex" xmlns:cx8="http://schemas.microsoft.com/office/drawing/2016/5/14/chartex" xmlns:mc="http://schemas.openxmlformats.org/markup-compatibility/2006" xmlns:aink="http://schemas.microsoft.com/office/drawing/2016/ink" xmlns:am3d="http://schemas.microsoft.com/office/drawing/2017/model3d" xmlns:o="urn:schemas-microsoft-com:office:office" xmlns:r="http://schemas.openxmlformats.org/officeDocument/2006/relationships" xmlns:m="http://schemas.openxmlformats.org/officeDocument/2006/math" xmlns:v="urn:schemas-microsoft-com:vml" xmlns:wp14="http://schemas.microsoft.com/office/word/2010/wordprocessingDrawing" xmlns:wp="http://schemas.openxmlformats.org/drawingml/2006/wordprocessingDrawing" xmlns:w10="urn:schemas-microsoft-com:office:word" xmlns:w="http://schemas.openxmlformats.org/wordprocessingml/2006/main" xmlns:w14="http://schemas.microsoft.com/office/word/2010/wordml" xmlns:w15="http://schemas.microsoft.com/office/word/2012/wordml" xmlns:w16cex="http://schemas.microsoft.com/office/word/2018/wordml/cex" xmlns:w16cid="http://schemas.microsoft.com/office/word/2016/wordml/cid" xmlns:w16="http://schemas.microsoft.com/office/word/2018/wordml" xmlns:w16sdtdh="http://schemas.microsoft.com/office/word/2020/wordml/sdtdatahash" xmlns:w16se="http://schemas.microsoft.com/office/word/2015/wordml/symex" xmlns:wpg="http://schemas.microsoft.com/office/word/2010/wordprocessingGroup" xmlns:wpi="http://schemas.microsoft.com/office/word/2010/wordprocessingInk" xmlns:wne="http://schemas.microsoft.com/office/word/2006/wordml" xmlns:wps="http://schemas.microsoft.com/office/word/2010/wordprocessingShape" mc:Ignorable="w14 w15 w16se w16cid w16 w16cex w16sdtdh wp14">
   <w:body>
+    <w:tbl>
+      <w:tblPr>
+        <w:tblStyle w:val="a3"/>
+        <w:tblW w:w="0" w:type="auto"/>
+        <w:tblBorders>
+          <w:top w:val="none" w:sz="0" w:space="0" w:color="auto"/>
+          <w:left w:val="none" w:sz="0" w:space="0" w:color="auto"/>
+          <w:bottom w:val="none" w:sz="0" w:space="0" w:color="auto"/>
+          <w:right w:val="none" w:sz="0" w:space="0" w:color="auto"/>
+          <w:insideH w:val="none" w:sz="0" w:space="0" w:color="auto"/>
+          <w:insideV w:val="none" w:sz="0" w:space="0" w:color="auto"/>
+        </w:tblBorders>
+        <w:tblLook w:val="04A0" w:firstRow="1" w:lastRow="0" w:firstColumn="1" w:lastColumn="0" w:noHBand="0" w:noVBand="1"/>
+      </w:tblPr>
+      <w:tblGrid>
+        <w:gridCol w:w="3103"/>
+        <w:gridCol w:w="3147"/>
+        <w:gridCol w:w="4206"/>
+      </w:tblGrid>
+      <w:tr>
+        <w:tc>
+          <w:tcPr>
+            <w:tcW w:w="3103" w:type="dxa"/>
+          </w:tcPr>
+          <w:p>
+            <w:pPr>
+              <w:rPr>
+                <w:lang w:val="en-US"/>
+              </w:rPr>
+            </w:pPr>
+            <w:r>
+              <w:rPr>
+                <w:lang w:val="en-US"/>
+              </w:rPr>
+              <w:t>{%logo}</w:t>
+            </w:r>
+          </w:p>
+        </w:tc>
+        <w:tc>
+          <w:tcPr>
+            <w:tcW w:w="3147" w:type="dxa"/>
+          </w:tcPr>
+          <w:p>
+            <w:pPr>
+              <w:jc w:val="center"/>
+              <w:rPr>
+                <w:b/>
+                <w:sz w:val="24"/>
+              </w:rPr>
+            </w:pPr>
+            <w:r>
+              <w:rPr>
+                <w:b/>
+                <w:sz w:val="24"/>
+              </w:rPr>
+              <w:t>Заявка от</w:t>
+            </w:r>
+            <w:r>
+              <w:rPr>
+                <w:b/>
+                <w:sz w:val="24"/>
+              </w:rPr>
+              <w:t xml:space="preserve"> {</w:t>
+            </w:r>
+            <w:r>
+              <w:rPr>
+                <w:b/>
+                <w:sz w:val="24"/>
+                <w:lang w:val="en-US"/>
+              </w:rPr>
+              <w:t>date</w:t>
+            </w:r>
+            <w:r>
+              <w:rPr>
+                <w:b/>
+                <w:sz w:val="24"/>
+              </w:rPr>
+              <w:t>}</w:t>
+            </w:r>
+            <w:r>
+              <w:rPr>
+                <w:b/>
+                <w:sz w:val="24"/>
+              </w:rPr>
+              <w:t>.</w:t>
+            </w:r>
+          </w:p>
+          <w:p>
+            <w:pPr>
+              <w:jc w:val="center"/>
+              <w:rPr>
+                <w:lang w:val="en-US"/>
+              </w:rPr>
+            </w:pPr>
+            <w:r>
+              <w:rPr>
+                <w:b/>
+                <w:sz w:val="24"/>
+              </w:rPr>
+              <w:t>{</w:t>
+            </w:r>
+            <w:r>
+              <w:rPr>
+                <w:b/>
+                <w:sz w:val="24"/>
+                <w:lang w:val="en-US"/>
+              </w:rPr>
+              <w:t>number</w:t>
+            </w:r>
+            <w:r>
+              <w:rPr>
+                <w:b/>
+                <w:sz w:val="24"/>
+              </w:rPr>
+              <w:t>}</w:t>
+            </w:r>
+          </w:p>
+        </w:tc>
+        <w:tc>
+          <w:tcPr>
+            <w:tcW w:w="4206" w:type="dxa"/>
+          </w:tcPr>
+          <w:p>
+            <w:pPr>
+              <w:jc w:val="right"/>
+              <w:rPr>
+                <w:b/>
+                <w:sz w:val="18"/>
+                <w:szCs w:val="18"/>
+              </w:rPr>
+            </w:pPr>
+            <w:r>
+              <w:rPr>
+                <w:b/>
+                <w:sz w:val="18"/>
+                <w:szCs w:val="18"/>
+              </w:rPr>
+              <w:t>Приложение №1</w:t>
+            </w:r>
+          </w:p>
+          <w:p>
+            <w:pPr>
+              <w:jc w:val="right"/>
+              <w:rPr>
+                <w:lang w:val="en-US"/>
+              </w:rPr>
+            </w:pPr>
+            <w:r>
+              <w:rPr>
+                <w:noProof/>
+                <w:lang w:val="en-US"/>
+              </w:rPr>
+              <w:drawing>
+                <wp:inline distT="0" distB="0" distL="0" distR="0" wp14:anchorId="432BFFFB" wp14:editId="6B672A1D">
+                  <wp:extent cx="2529840" cy="365760"/>
+                  <wp:effectExtent l="0" t="0" r="3810" b="0"/>
+                  <wp:docPr id="1" name="Рисунок 1"/>
+                  <wp:cNvGraphicFramePr>
+                    <a:graphicFrameLocks xmlns:a="http://schemas.openxmlformats.org/drawingml/2006/main" noChangeAspect="1"/>
+                  </wp:cNvGraphicFramePr>
+                  <a:graphic xmlns:a="http://schemas.openxmlformats.org/drawingml/2006/main">
+                    <a:graphicData uri="http://schemas.openxmlformats.org/drawingml/2006/picture">
+                      <pic:pic xmlns:pic="http://schemas.openxmlformats.org/drawingml/2006/picture">
+                        <pic:nvPicPr>
+                          <pic:cNvPr id="0" name="Picture 2"/>
+                          <pic:cNvPicPr>
+                            <a:picLocks noChangeAspect="1" noChangeArrowheads="1"/>
+                          </pic:cNvPicPr>
+                        </pic:nvPicPr>
+                        <pic:blipFill>
+                          <a:blip r:embed="rId5">
+                            <a:extLst>
+                              <a:ext uri="{28A0092B-C50C-407E-A947-70E740481C1C}">
+                                <a14:useLocalDpi xmlns:a14="http://schemas.microsoft.com/office/drawing/2010/main" val="0"/>
+                              </a:ext>
+                            </a:extLst>
+                          </a:blip>
+                          <a:srcRect/>
+                          <a:stretch>
+                            <a:fillRect/>
+                          </a:stretch>
+                        </pic:blipFill>
+                        <pic:spPr bwMode="auto">
+                          <a:xfrm>
+                            <a:off x="0" y="0"/>
+                            <a:ext cx="2529840" cy="365760"/>
+                          </a:xfrm>
+                          <a:prstGeom prst="rect">
+                            <a:avLst/>
+                          </a:prstGeom>
+                          <a:noFill/>
+                        </pic:spPr>
+                      </pic:pic>
+                    </a:graphicData>
+                  </a:graphic>
+                </wp:inline>
+              </w:drawing>
+            </w:r>
+          </w:p>
+        </w:tc>
+      </w:tr>
+    </w:tbl>
     <w:p>
       <w:pPr>
-        <w:spacing w:after="0"/>
-        <w:ind w:left="2832" w:firstLine="708"/>
-        <w:rPr>
-          <w:b/>
-          <w:sz w:val="18"/>
-          <w:szCs w:val="18"/>
-        </w:rPr>
-      </w:pPr>
-      <w:r>
-        <w:rPr>
-          <w:noProof/>
-        </w:rPr>
-        <w:drawing>
-          <wp:anchor distT="0" distB="0" distL="114300" distR="114300" simplePos="0" relativeHeight="251659264" behindDoc="0" locked="0" layoutInCell="1" allowOverlap="1" wp14:anchorId="1076E42B" wp14:editId="7B589019">
-            <wp:simplePos x="0" y="0"/>
-            <wp:positionH relativeFrom="column">
-              <wp:posOffset>15240</wp:posOffset>
-            </wp:positionH>
-            <wp:positionV relativeFrom="paragraph">
-              <wp:posOffset>22860</wp:posOffset>
-            </wp:positionV>
-            <wp:extent cx="1649232" cy="533400"/>
-            <wp:effectExtent l="0" t="0" r="0" b="0"/>
-            <wp:wrapNone/>
-            <wp:docPr id="2" name="Рисунок 1">
-              <a:extLst xmlns:a="http://schemas.openxmlformats.org/drawingml/2006/main">
-                <a:ext uri="{FF2B5EF4-FFF2-40B4-BE49-F238E27FC236}">
-                  <a16:creationId xmlns:a16="http://schemas.microsoft.com/office/drawing/2014/main" id="{C9069847-A424-4C76-8E6C-EBF671BB39CC}"/>
-                </a:ext>
-              </a:extLst>
-            </wp:docPr>
-            <wp:cNvGraphicFramePr>
-              <a:graphicFrameLocks xmlns:a="http://schemas.openxmlformats.org/drawingml/2006/main" noChangeAspect="1"/>
-            </wp:cNvGraphicFramePr>
-            <a:graphic xmlns:a="http://schemas.openxmlformats.org/drawingml/2006/main">
-              <a:graphicData uri="http://schemas.openxmlformats.org/drawingml/2006/picture">
-                <pic:pic xmlns:pic="http://schemas.openxmlformats.org/drawingml/2006/picture">
-                  <pic:nvPicPr>
-                    <pic:cNvPr id="2" name="Рисунок 1">
-                      <a:extLst>
-                        <a:ext uri="{FF2B5EF4-FFF2-40B4-BE49-F238E27FC236}">
-                          <a16:creationId xmlns:a16="http://schemas.microsoft.com/office/drawing/2014/main" id="{C9069847-A424-4C76-8E6C-EBF671BB39CC}"/>
-                        </a:ext>
-                      </a:extLst>
-                    </pic:cNvPr>
-                    <pic:cNvPicPr>
-                      <a:picLocks noChangeAspect="1"/>
-                    </pic:cNvPicPr>
-                  </pic:nvPicPr>
-                  <pic:blipFill rotWithShape="1">
-                    <a:blip r:embed="rId5" cstate="print">
-                      <a:extLst>
-                        <a:ext uri="{28A0092B-C50C-407E-A947-70E740481C1C}">
-                          <a14:useLocalDpi xmlns:a14="http://schemas.microsoft.com/office/drawing/2010/main" val="0"/>
-                        </a:ext>
-                      </a:extLst>
-                    </a:blip>
-                    <a:srcRect t="29986" b="18475"/>
-                    <a:stretch/>
-                  </pic:blipFill>
-                  <pic:spPr>
-                    <a:xfrm>
-                      <a:off x="0" y="0"/>
-                      <a:ext cx="1663929" cy="538153"/>
-                    </a:xfrm>
-                    <a:prstGeom prst="rect">
-                      <a:avLst/>
-                    </a:prstGeom>
-                  </pic:spPr>
-                </pic:pic>
-              </a:graphicData>
-            </a:graphic>
-            <wp14:sizeRelH relativeFrom="margin">
-              <wp14:pctWidth>0</wp14:pctWidth>
-            </wp14:sizeRelH>
-            <wp14:sizeRelV relativeFrom="margin">
-              <wp14:pctHeight>0</wp14:pctHeight>
-            </wp14:sizeRelV>
-          </wp:anchor>
-        </w:drawing>
-      </w:r>
-      <w:r>
-        <w:rPr>
-          <w:rFonts w:ascii="Times New Roman" w:hAnsi="Times New Roman" w:cs="Times New Roman"/>
-          <w:noProof/>
-          <w:sz w:val="20"/>
-        </w:rPr>
-        <w:drawing>
-          <wp:anchor distT="0" distB="0" distL="114300" distR="114300" simplePos="0" relativeHeight="251660288" behindDoc="0" locked="0" layoutInCell="1" allowOverlap="1" wp14:anchorId="551D26A1" wp14:editId="0996B8ED">
-            <wp:simplePos x="0" y="0"/>
-            <wp:positionH relativeFrom="column">
-              <wp:posOffset>4057650</wp:posOffset>
-            </wp:positionH>
-            <wp:positionV relativeFrom="paragraph">
-              <wp:posOffset>146050</wp:posOffset>
-            </wp:positionV>
-            <wp:extent cx="2609850" cy="370205"/>
-            <wp:effectExtent l="0" t="0" r="0" b="0"/>
-            <wp:wrapNone/>
-            <wp:docPr id="4" name="Рисунок 4"/>
-            <wp:cNvGraphicFramePr>
-              <a:graphicFrameLocks xmlns:a="http://schemas.openxmlformats.org/drawingml/2006/main" noChangeAspect="1"/>
-            </wp:cNvGraphicFramePr>
-            <a:graphic xmlns:a="http://schemas.openxmlformats.org/drawingml/2006/main">
-              <a:graphicData uri="http://schemas.openxmlformats.org/drawingml/2006/picture">
-                <pic:pic xmlns:pic="http://schemas.openxmlformats.org/drawingml/2006/picture">
-                  <pic:nvPicPr>
-                    <pic:cNvPr id="1" name=""/>
-                    <pic:cNvPicPr/>
-                  </pic:nvPicPr>
-                  <pic:blipFill>
-                    <a:blip r:embed="rId6">
-                      <a:extLst>
-                        <a:ext uri="{28A0092B-C50C-407E-A947-70E740481C1C}">
-                          <a14:useLocalDpi xmlns:a14="http://schemas.microsoft.com/office/drawing/2010/main" val="0"/>
-                        </a:ext>
-                      </a:extLst>
-                    </a:blip>
-                    <a:stretch>
-                      <a:fillRect/>
-                    </a:stretch>
-                  </pic:blipFill>
-                  <pic:spPr>
-                    <a:xfrm>
-                      <a:off x="0" y="0"/>
-                      <a:ext cx="2609850" cy="370205"/>
-                    </a:xfrm>
-                    <a:prstGeom prst="rect">
-                      <a:avLst/>
-                    </a:prstGeom>
-                  </pic:spPr>
-                </pic:pic>
-              </a:graphicData>
-            </a:graphic>
-          </wp:anchor>
-        </w:drawing>
-      </w:r>
-      <w:r>
-        <w:rPr>
-          <w:rFonts w:ascii="Times New Roman" w:hAnsi="Times New Roman" w:cs="Times New Roman"/>
-          <w:b/>
-          <w:sz w:val="24"/>
-        </w:rPr>
-        <w:t>Заявка</w:t>
-      </w:r>
-      <w:r>
-        <w:rPr>
-          <w:rFonts w:ascii="Times New Roman" w:hAnsi="Times New Roman" w:cs="Times New Roman"/>
-          <w:b/>
-          <w:sz w:val="24"/>
-        </w:rPr>
-        <w:t xml:space="preserve"> </w:t>
-      </w:r>
-      <w:r>
-        <w:rPr>
-          <w:rFonts w:ascii="Times New Roman" w:hAnsi="Times New Roman" w:cs="Times New Roman"/>
-          <w:b/>
-          <w:sz w:val="24"/>
-        </w:rPr>
-        <w:t>о</w:t>
-      </w:r>
-      <w:r>
-        <w:rPr>
-          <w:rFonts w:ascii="Times New Roman" w:hAnsi="Times New Roman" w:cs="Times New Roman"/>
-          <w:b/>
-          <w:sz w:val="24"/>
-        </w:rPr>
-        <w:t>т</w:t>
-      </w:r>
-      <w:r>
-        <w:rPr>
-          <w:rFonts w:ascii="Times New Roman" w:hAnsi="Times New Roman" w:cs="Times New Roman"/>
-          <w:b/>
-          <w:sz w:val="24"/>
-        </w:rPr>
-        <w:t xml:space="preserve"> {</w:t>
-      </w:r>
-      <w:r>
-        <w:rPr>
-          <w:rFonts w:ascii="Times New Roman" w:hAnsi="Times New Roman" w:cs="Times New Roman"/>
-          <w:b/>
-          <w:sz w:val="24"/>
-          <w:lang w:val="en-US"/>
-        </w:rPr>
-        <w:t>date</w:t>
-      </w:r>
-      <w:r>
-        <w:rPr>
-          <w:rFonts w:ascii="Times New Roman" w:hAnsi="Times New Roman" w:cs="Times New Roman"/>
-          <w:b/>
-          <w:sz w:val="24"/>
-        </w:rPr>
-        <w:t>}</w:t>
-      </w:r>
-      <w:r>
-        <w:rPr>
-          <w:rFonts w:ascii="Times New Roman" w:hAnsi="Times New Roman" w:cs="Times New Roman"/>
-          <w:b/>
-          <w:sz w:val="24"/>
-        </w:rPr>
-        <w:t>.</w:t>
-      </w:r>
-      <w:r>
-        <w:rPr>
-          <w:rFonts w:ascii="Times New Roman" w:hAnsi="Times New Roman" w:cs="Times New Roman"/>
-          <w:b/>
-          <w:sz w:val="24"/>
-        </w:rPr>
-        <w:t xml:space="preserve">                               </w:t>
-      </w:r>
-      <w:r>
-        <w:rPr>
-          <w:rFonts w:ascii="Times New Roman" w:hAnsi="Times New Roman" w:cs="Times New Roman"/>
-          <w:b/>
-          <w:sz w:val="24"/>
-        </w:rPr>
-        <w:tab/>
-      </w:r>
-      <w:r>
-        <w:rPr>
-          <w:rFonts w:ascii="Times New Roman" w:hAnsi="Times New Roman" w:cs="Times New Roman"/>
-          <w:b/>
-          <w:sz w:val="24"/>
-        </w:rPr>
-        <w:tab/>
-      </w:r>
-      <w:r>
-        <w:rPr>
-          <w:rFonts w:ascii="Times New Roman" w:hAnsi="Times New Roman" w:cs="Times New Roman"/>
-          <w:b/>
-          <w:sz w:val="24"/>
-        </w:rPr>
-        <w:t xml:space="preserve">        </w:t>
-      </w:r>
-      <w:r>
-        <w:rPr>
-          <w:b/>
-          <w:sz w:val="18"/>
-          <w:szCs w:val="18"/>
-        </w:rPr>
-        <w:t>Приложение №1</w:t>
-      </w:r>
-    </w:p>
-    <w:p>
-      <w:pPr>
-        <w:spacing w:after="0"/>
-        <w:ind w:left="2832" w:firstLine="708"/>
-        <w:rPr>
-          <w:rFonts w:ascii="Times New Roman" w:hAnsi="Times New Roman" w:cs="Times New Roman"/>
-          <w:b/>
-          <w:sz w:val="24"/>
-          <w:lang w:val="en-US"/>
-        </w:rPr>
-      </w:pPr>
-      <w:r>
-        <w:rPr>
-          <w:rFonts w:ascii="Times New Roman" w:hAnsi="Times New Roman" w:cs="Times New Roman"/>
-          <w:b/>
-          <w:sz w:val="24"/>
-          <w:lang w:val="en-US"/>
-        </w:rPr>
-        <w:t>{number}</w:t>
-      </w:r>
-    </w:p>
-    <w:p>
-      <w:pPr>
         <w:rPr>
           <w:rFonts w:ascii="Times New Roman" w:hAnsi="Times New Roman" w:cs="Times New Roman"/>
           <w:sz w:val="20"/>
+          <w:lang w:val="en-US"/>
         </w:rPr>
       </w:pPr>
     </w:p>
@@ -2814,7 +2751,6 @@
         <w:rPr>
           <w:b/>
           <w:sz w:val="24"/>
-          <w:lang w:val="en-US"/>
         </w:rPr>
       </w:pPr>
     </w:p>
@@ -2828,17 +2764,6 @@
           <w:lang w:val="en-US"/>
         </w:rPr>
       </w:pPr>
-    </w:p>
-    <w:p>
-      <w:pPr>
-        <w:pStyle w:val="a4"/>
-        <w:jc w:val="both"/>
-        <w:rPr>
-          <w:b/>
-          <w:sz w:val="24"/>
-          <w:lang w:val="en-US"/>
-        </w:rPr>
-      </w:pPr>
       <w:r>
         <w:rPr>
           <w:b/>
@@ -3077,7 +3002,6 @@
           <w:sz w:val="20"/>
           <w:lang w:val="en-US"/>
         </w:rPr>
-        <w:lastRenderedPageBreak/>
         <w:t xml:space="preserve">                                                                </w:t>
       </w:r>
     </w:p>
@@ -3500,6 +3424,7 @@
   <w:style w:type="character" w:default="1" w:styleId="a0">
     <w:name w:val="Default Paragraph Font"/>
     <w:uiPriority w:val="1"/>
+    <w:semiHidden/>
     <w:unhideWhenUsed/>
   </w:style>
   <w:style w:type="table" w:default="1" w:styleId="a1">

</xml_diff>